<commit_message>
docs(stage20): audit IT project management evidence
</commit_message>
<xml_diff>
--- a/reports/stage20/it-project-management/BAO_CAO_QUAN_LY_DU_AN_CNTT_WORKSPHERE.docx
+++ b/reports/stage20/it-project-management/BAO_CAO_QUAN_LY_DU_AN_CNTT_WORKSPHERE.docx
@@ -23,7 +23,7 @@
     </w:p>
     <w:p>
       <w:pPr>
-        <w:spacing w:after="400"/>
+        <w:spacing w:after="360"/>
       </w:pPr>
     </w:p>
     <w:p>
@@ -45,7 +45,7 @@
           <w:rFonts w:ascii="Times New Roman" w:hAnsi="Times New Roman"/>
           <w:b/>
           <w:color w:val="1B365D"/>
-          <w:sz w:val="32"/>
+          <w:sz w:val="30"/>
         </w:rPr>
         <w:t>HỌC PHẦN: QUẢN LÝ DỰ ÁN CÔNG NGHỆ THÔNG TIN</w:t>
         <w:br/>
@@ -56,7 +56,7 @@
           <w:rFonts w:ascii="Times New Roman" w:hAnsi="Times New Roman"/>
           <w:b/>
           <w:color w:val="1B365D"/>
-          <w:sz w:val="30"/>
+          <w:sz w:val="28"/>
         </w:rPr>
         <w:t>ĐỀ TÀI:</w:t>
         <w:br/>
@@ -66,7 +66,7 @@
     </w:p>
     <w:p>
       <w:pPr>
-        <w:spacing w:after="500"/>
+        <w:spacing w:after="400"/>
       </w:pPr>
     </w:p>
     <w:tbl>
@@ -77,14 +77,15 @@
         <w:tblLook w:firstColumn="1" w:firstRow="1" w:lastColumn="0" w:lastRow="0" w:noHBand="0" w:noVBand="1" w:val="04A0"/>
       </w:tblPr>
       <w:tblGrid>
-        <w:gridCol w:w="3120"/>
-        <w:gridCol w:w="3120"/>
-        <w:gridCol w:w="3120"/>
+        <w:gridCol w:w="2340"/>
+        <w:gridCol w:w="2340"/>
+        <w:gridCol w:w="2340"/>
+        <w:gridCol w:w="2340"/>
       </w:tblGrid>
       <w:tr>
         <w:tc>
           <w:tcPr>
-            <w:tcW w:type="dxa" w:w="1152"/>
+            <w:tcW w:type="dxa" w:w="864"/>
             <w:shd w:fill="1B365D"/>
           </w:tcPr>
           <w:p>
@@ -96,7 +97,7 @@
                 <w:rFonts w:ascii="Times New Roman" w:hAnsi="Times New Roman"/>
                 <w:b/>
                 <w:color w:val="FFFFFF"/>
-                <w:sz w:val="19"/>
+                <w:sz w:val="18"/>
               </w:rPr>
               <w:t>STT</w:t>
             </w:r>
@@ -104,7 +105,7 @@
         </w:tc>
         <w:tc>
           <w:tcPr>
-            <w:tcW w:type="dxa" w:w="4608"/>
+            <w:tcW w:type="dxa" w:w="4032"/>
             <w:shd w:fill="1B365D"/>
           </w:tcPr>
           <w:p>
@@ -116,7 +117,7 @@
                 <w:rFonts w:ascii="Times New Roman" w:hAnsi="Times New Roman"/>
                 <w:b/>
                 <w:color w:val="FFFFFF"/>
-                <w:sz w:val="19"/>
+                <w:sz w:val="18"/>
               </w:rPr>
               <w:t>Họ và Tên Thành Viên</w:t>
             </w:r>
@@ -124,7 +125,7 @@
         </w:tc>
         <w:tc>
           <w:tcPr>
-            <w:tcW w:type="dxa" w:w="2880"/>
+            <w:tcW w:type="dxa" w:w="2016"/>
             <w:shd w:fill="1B365D"/>
           </w:tcPr>
           <w:p>
@@ -136,9 +137,29 @@
                 <w:rFonts w:ascii="Times New Roman" w:hAnsi="Times New Roman"/>
                 <w:b/>
                 <w:color w:val="FFFFFF"/>
-                <w:sz w:val="19"/>
+                <w:sz w:val="18"/>
               </w:rPr>
               <w:t>Mã Sinh Viên</w:t>
+            </w:r>
+          </w:p>
+        </w:tc>
+        <w:tc>
+          <w:tcPr>
+            <w:tcW w:type="dxa" w:w="2304"/>
+            <w:shd w:fill="1B365D"/>
+          </w:tcPr>
+          <w:p>
+            <w:pPr>
+              <w:jc w:val="center"/>
+            </w:pPr>
+            <w:r>
+              <w:rPr>
+                <w:rFonts w:ascii="Times New Roman" w:hAnsi="Times New Roman"/>
+                <w:b/>
+                <w:color w:val="FFFFFF"/>
+                <w:sz w:val="18"/>
+              </w:rPr>
+              <w:t>Vai trò môn học</w:t>
             </w:r>
           </w:p>
         </w:tc>
@@ -146,7 +167,7 @@
       <w:tr>
         <w:tc>
           <w:tcPr>
-            <w:tcW w:type="dxa" w:w="1152"/>
+            <w:tcW w:type="dxa" w:w="864"/>
             <w:shd w:fill="F8F9FA"/>
           </w:tcPr>
           <w:p>
@@ -166,7 +187,7 @@
         </w:tc>
         <w:tc>
           <w:tcPr>
-            <w:tcW w:type="dxa" w:w="4608"/>
+            <w:tcW w:type="dxa" w:w="4032"/>
             <w:shd w:fill="F8F9FA"/>
           </w:tcPr>
           <w:p>
@@ -180,13 +201,13 @@
                 <w:color w:val="222222"/>
                 <w:sz w:val="17"/>
               </w:rPr>
-              <w:t>Nguyễn Minh Hiếu (Nhóm trưởng / PM)</w:t>
-            </w:r>
-          </w:p>
-        </w:tc>
-        <w:tc>
-          <w:tcPr>
-            <w:tcW w:type="dxa" w:w="2880"/>
+              <w:t>Nguyễn Minh Hiếu</w:t>
+            </w:r>
+          </w:p>
+        </w:tc>
+        <w:tc>
+          <w:tcPr>
+            <w:tcW w:type="dxa" w:w="2016"/>
             <w:shd w:fill="F8F9FA"/>
           </w:tcPr>
           <w:p>
@@ -201,6 +222,26 @@
                 <w:sz w:val="17"/>
               </w:rPr>
               <w:t>BIT247729</w:t>
+            </w:r>
+          </w:p>
+        </w:tc>
+        <w:tc>
+          <w:tcPr>
+            <w:tcW w:type="dxa" w:w="2304"/>
+            <w:shd w:fill="F8F9FA"/>
+          </w:tcPr>
+          <w:p>
+            <w:pPr>
+              <w:spacing w:line="252" w:lineRule="auto" w:after="40"/>
+              <w:jc w:val="left"/>
+            </w:pPr>
+            <w:r>
+              <w:rPr>
+                <w:rFonts w:ascii="Times New Roman" w:hAnsi="Times New Roman"/>
+                <w:color w:val="222222"/>
+                <w:sz w:val="17"/>
+              </w:rPr>
+              <w:t>Nhóm trưởng chính thức</w:t>
             </w:r>
           </w:p>
         </w:tc>
@@ -208,7 +249,7 @@
       <w:tr>
         <w:tc>
           <w:tcPr>
-            <w:tcW w:type="dxa" w:w="1152"/>
+            <w:tcW w:type="dxa" w:w="864"/>
             <w:shd w:fill="FFFFFF"/>
           </w:tcPr>
           <w:p>
@@ -228,7 +269,7 @@
         </w:tc>
         <w:tc>
           <w:tcPr>
-            <w:tcW w:type="dxa" w:w="4608"/>
+            <w:tcW w:type="dxa" w:w="4032"/>
             <w:shd w:fill="FFFFFF"/>
           </w:tcPr>
           <w:p>
@@ -242,13 +283,13 @@
                 <w:color w:val="222222"/>
                 <w:sz w:val="17"/>
               </w:rPr>
-              <w:t>Nguyễn Văn Cường (Mobile Lead / Architect)</w:t>
-            </w:r>
-          </w:p>
-        </w:tc>
-        <w:tc>
-          <w:tcPr>
-            <w:tcW w:type="dxa" w:w="2880"/>
+              <w:t>Nguyễn Văn Cường</w:t>
+            </w:r>
+          </w:p>
+        </w:tc>
+        <w:tc>
+          <w:tcPr>
+            <w:tcW w:type="dxa" w:w="2016"/>
             <w:shd w:fill="FFFFFF"/>
           </w:tcPr>
           <w:p>
@@ -263,6 +304,26 @@
                 <w:sz w:val="17"/>
               </w:rPr>
               <w:t>BIT240048</w:t>
+            </w:r>
+          </w:p>
+        </w:tc>
+        <w:tc>
+          <w:tcPr>
+            <w:tcW w:type="dxa" w:w="2304"/>
+            <w:shd w:fill="FFFFFF"/>
+          </w:tcPr>
+          <w:p>
+            <w:pPr>
+              <w:spacing w:line="252" w:lineRule="auto" w:after="40"/>
+              <w:jc w:val="center"/>
+            </w:pPr>
+            <w:r>
+              <w:rPr>
+                <w:rFonts w:ascii="Times New Roman" w:hAnsi="Times New Roman"/>
+                <w:color w:val="222222"/>
+                <w:sz w:val="17"/>
+              </w:rPr>
+              <w:t>Thành viên</w:t>
             </w:r>
           </w:p>
         </w:tc>
@@ -270,7 +331,7 @@
       <w:tr>
         <w:tc>
           <w:tcPr>
-            <w:tcW w:type="dxa" w:w="1152"/>
+            <w:tcW w:type="dxa" w:w="864"/>
             <w:shd w:fill="F8F9FA"/>
           </w:tcPr>
           <w:p>
@@ -290,12 +351,32 @@
         </w:tc>
         <w:tc>
           <w:tcPr>
-            <w:tcW w:type="dxa" w:w="4608"/>
+            <w:tcW w:type="dxa" w:w="4032"/>
             <w:shd w:fill="F8F9FA"/>
           </w:tcPr>
           <w:p>
             <w:pPr>
               <w:spacing w:line="252" w:lineRule="auto" w:after="40"/>
+              <w:jc w:val="center"/>
+            </w:pPr>
+            <w:r>
+              <w:rPr>
+                <w:rFonts w:ascii="Times New Roman" w:hAnsi="Times New Roman"/>
+                <w:color w:val="222222"/>
+                <w:sz w:val="17"/>
+              </w:rPr>
+              <w:t>Hoàng Bảo Long</w:t>
+            </w:r>
+          </w:p>
+        </w:tc>
+        <w:tc>
+          <w:tcPr>
+            <w:tcW w:type="dxa" w:w="2016"/>
+            <w:shd w:fill="F8F9FA"/>
+          </w:tcPr>
+          <w:p>
+            <w:pPr>
+              <w:spacing w:line="252" w:lineRule="auto" w:after="40"/>
               <w:jc w:val="left"/>
             </w:pPr>
             <w:r>
@@ -304,27 +385,27 @@
                 <w:color w:val="222222"/>
                 <w:sz w:val="17"/>
               </w:rPr>
-              <w:t>Hoàng Bảo Long (Backend Lead / DevOps)</w:t>
-            </w:r>
-          </w:p>
-        </w:tc>
-        <w:tc>
-          <w:tcPr>
-            <w:tcW w:type="dxa" w:w="2880"/>
+              <w:t>BIT240142</w:t>
+            </w:r>
+          </w:p>
+        </w:tc>
+        <w:tc>
+          <w:tcPr>
+            <w:tcW w:type="dxa" w:w="2304"/>
             <w:shd w:fill="F8F9FA"/>
           </w:tcPr>
           <w:p>
             <w:pPr>
               <w:spacing w:line="252" w:lineRule="auto" w:after="40"/>
-              <w:jc w:val="left"/>
-            </w:pPr>
-            <w:r>
-              <w:rPr>
-                <w:rFonts w:ascii="Times New Roman" w:hAnsi="Times New Roman"/>
-                <w:color w:val="222222"/>
-                <w:sz w:val="17"/>
-              </w:rPr>
-              <w:t>BIT240142</w:t>
+              <w:jc w:val="center"/>
+            </w:pPr>
+            <w:r>
+              <w:rPr>
+                <w:rFonts w:ascii="Times New Roman" w:hAnsi="Times New Roman"/>
+                <w:color w:val="222222"/>
+                <w:sz w:val="17"/>
+              </w:rPr>
+              <w:t>Thành viên</w:t>
             </w:r>
           </w:p>
         </w:tc>
@@ -332,7 +413,7 @@
       <w:tr>
         <w:tc>
           <w:tcPr>
-            <w:tcW w:type="dxa" w:w="1152"/>
+            <w:tcW w:type="dxa" w:w="864"/>
             <w:shd w:fill="FFFFFF"/>
           </w:tcPr>
           <w:p>
@@ -352,7 +433,7 @@
         </w:tc>
         <w:tc>
           <w:tcPr>
-            <w:tcW w:type="dxa" w:w="4608"/>
+            <w:tcW w:type="dxa" w:w="4032"/>
             <w:shd w:fill="FFFFFF"/>
           </w:tcPr>
           <w:p>
@@ -366,13 +447,13 @@
                 <w:color w:val="222222"/>
                 <w:sz w:val="17"/>
               </w:rPr>
-              <w:t>Vũ Thị Thu Hướng (QA / Test Lead)</w:t>
-            </w:r>
-          </w:p>
-        </w:tc>
-        <w:tc>
-          <w:tcPr>
-            <w:tcW w:type="dxa" w:w="2880"/>
+              <w:t>Vũ Thị Thu Hướng</w:t>
+            </w:r>
+          </w:p>
+        </w:tc>
+        <w:tc>
+          <w:tcPr>
+            <w:tcW w:type="dxa" w:w="2016"/>
             <w:shd w:fill="FFFFFF"/>
           </w:tcPr>
           <w:p>
@@ -387,6 +468,26 @@
                 <w:sz w:val="17"/>
               </w:rPr>
               <w:t>BIT240113</w:t>
+            </w:r>
+          </w:p>
+        </w:tc>
+        <w:tc>
+          <w:tcPr>
+            <w:tcW w:type="dxa" w:w="2304"/>
+            <w:shd w:fill="FFFFFF"/>
+          </w:tcPr>
+          <w:p>
+            <w:pPr>
+              <w:spacing w:line="252" w:lineRule="auto" w:after="40"/>
+              <w:jc w:val="center"/>
+            </w:pPr>
+            <w:r>
+              <w:rPr>
+                <w:rFonts w:ascii="Times New Roman" w:hAnsi="Times New Roman"/>
+                <w:color w:val="222222"/>
+                <w:sz w:val="17"/>
+              </w:rPr>
+              <w:t>Thành viên</w:t>
             </w:r>
           </w:p>
         </w:tc>
@@ -394,7 +495,22 @@
     </w:tbl>
     <w:p>
       <w:pPr>
-        <w:spacing w:after="800"/>
+        <w:spacing w:before="160"/>
+        <w:jc w:val="center"/>
+      </w:pPr>
+      <w:r>
+        <w:rPr>
+          <w:rFonts w:ascii="Times New Roman" w:hAnsi="Times New Roman"/>
+          <w:i/>
+          <w:color w:val="555555"/>
+          <w:sz w:val="19"/>
+        </w:rPr>
+        <w:t>*(Trạng thái phân công: PROPOSED_ASSIGNMENT_PENDING_USER_APPROVAL — Phân công biên soạn và thuyết trình đề xuất chờ Người dùng phê duyệt)*</w:t>
+      </w:r>
+    </w:p>
+    <w:p>
+      <w:pPr>
+        <w:spacing w:after="600"/>
       </w:pPr>
     </w:p>
     <w:p>
@@ -419,21 +535,21 @@
     <w:p>
       <w:pPr>
         <w:keepNext/>
-        <w:spacing w:before="240" w:after="120"/>
+        <w:spacing w:before="200" w:after="80"/>
       </w:pPr>
       <w:r>
         <w:rPr>
           <w:rFonts w:ascii="Times New Roman" w:hAnsi="Times New Roman"/>
           <w:b/>
           <w:color w:val="1B365D"/>
-          <w:sz w:val="30"/>
+          <w:sz w:val="28"/>
         </w:rPr>
-        <w:t>MỤC LỤC &amp; BẢNG ĐỐI CHIẾU RUBRIC ĐÁNH GIÁ GIỮA KỲ</w:t>
+        <w:t>MỤC LỤC &amp; BẢNG ĐỐI CHIẾU TIÊU CHÍ RUBRIC GIỮA KỲ</w:t>
       </w:r>
     </w:p>
     <w:p>
       <w:pPr>
-        <w:spacing w:line="276" w:lineRule="auto" w:after="80"/>
+        <w:spacing w:line="276" w:lineRule="auto" w:after="60"/>
       </w:pPr>
       <w:r>
         <w:rPr>
@@ -442,7 +558,7 @@
           <w:color w:val="222222"/>
           <w:sz w:val="22"/>
         </w:rPr>
-        <w:t>Bảng đối chiếu minh chứng theo đúng Rubric đánh giá 100 điểm của Giảng viên phụ trách học phần Quản lý dự án CNTT (Khoa CNTT &amp; TT — Trường Đại học CMC):</w:t>
+        <w:t>Bảng đối chiếu mức độ bao phủ các tiêu chí Rubric đánh giá bài tập nhóm giữa kỳ (Khoa CNTT &amp; TT — Trường Đại học CMC). Toàn bộ 6 nhóm tiêu chí đều được ánh xạ đầy đủ (RUBRIC_ITEMS_MAPPED = 100%), điểm số đánh giá chính thức do Giảng viên quyết định (FINAL_SCORE = INSTRUCTOR_DETERMINED):</w:t>
       </w:r>
     </w:p>
     <w:tbl>
@@ -453,15 +569,16 @@
         <w:tblLook w:firstColumn="1" w:firstRow="1" w:lastColumn="0" w:lastRow="0" w:noHBand="0" w:noVBand="1" w:val="04A0"/>
       </w:tblPr>
       <w:tblGrid>
-        <w:gridCol w:w="2340"/>
-        <w:gridCol w:w="2340"/>
-        <w:gridCol w:w="2340"/>
-        <w:gridCol w:w="2340"/>
+        <w:gridCol w:w="1872"/>
+        <w:gridCol w:w="1872"/>
+        <w:gridCol w:w="1872"/>
+        <w:gridCol w:w="1872"/>
+        <w:gridCol w:w="1872"/>
       </w:tblGrid>
       <w:tr>
         <w:tc>
           <w:tcPr>
-            <w:tcW w:type="dxa" w:w="2304"/>
+            <w:tcW w:type="dxa" w:w="2160"/>
             <w:shd w:fill="1B365D"/>
           </w:tcPr>
           <w:p>
@@ -473,7 +590,7 @@
                 <w:rFonts w:ascii="Times New Roman" w:hAnsi="Times New Roman"/>
                 <w:b/>
                 <w:color w:val="FFFFFF"/>
-                <w:sz w:val="19"/>
+                <w:sz w:val="18"/>
               </w:rPr>
               <w:t>Tiêu chí Rubric</w:t>
             </w:r>
@@ -481,7 +598,7 @@
         </w:tc>
         <w:tc>
           <w:tcPr>
-            <w:tcW w:type="dxa" w:w="1152"/>
+            <w:tcW w:type="dxa" w:w="1008"/>
             <w:shd w:fill="1B365D"/>
           </w:tcPr>
           <w:p>
@@ -493,7 +610,7 @@
                 <w:rFonts w:ascii="Times New Roman" w:hAnsi="Times New Roman"/>
                 <w:b/>
                 <w:color w:val="FFFFFF"/>
-                <w:sz w:val="19"/>
+                <w:sz w:val="18"/>
               </w:rPr>
               <w:t>Điểm</w:t>
             </w:r>
@@ -501,7 +618,7 @@
         </w:tc>
         <w:tc>
           <w:tcPr>
-            <w:tcW w:type="dxa" w:w="2016"/>
+            <w:tcW w:type="dxa" w:w="1872"/>
             <w:shd w:fill="1B365D"/>
           </w:tcPr>
           <w:p>
@@ -513,7 +630,7 @@
                 <w:rFonts w:ascii="Times New Roman" w:hAnsi="Times New Roman"/>
                 <w:b/>
                 <w:color w:val="FFFFFF"/>
-                <w:sz w:val="19"/>
+                <w:sz w:val="18"/>
               </w:rPr>
               <w:t>Vị trí trong báo cáo</w:t>
             </w:r>
@@ -521,7 +638,7 @@
         </w:tc>
         <w:tc>
           <w:tcPr>
-            <w:tcW w:type="dxa" w:w="3168"/>
+            <w:tcW w:type="dxa" w:w="2736"/>
             <w:shd w:fill="1B365D"/>
           </w:tcPr>
           <w:p>
@@ -533,9 +650,29 @@
                 <w:rFonts w:ascii="Times New Roman" w:hAnsi="Times New Roman"/>
                 <w:b/>
                 <w:color w:val="FFFFFF"/>
-                <w:sz w:val="19"/>
+                <w:sz w:val="18"/>
               </w:rPr>
               <w:t>Minh chứng đối soát chính thức</w:t>
+            </w:r>
+          </w:p>
+        </w:tc>
+        <w:tc>
+          <w:tcPr>
+            <w:tcW w:type="dxa" w:w="1440"/>
+            <w:shd w:fill="1B365D"/>
+          </w:tcPr>
+          <w:p>
+            <w:pPr>
+              <w:jc w:val="center"/>
+            </w:pPr>
+            <w:r>
+              <w:rPr>
+                <w:rFonts w:ascii="Times New Roman" w:hAnsi="Times New Roman"/>
+                <w:b/>
+                <w:color w:val="FFFFFF"/>
+                <w:sz w:val="18"/>
+              </w:rPr>
+              <w:t>Mức bao phủ</w:t>
             </w:r>
           </w:p>
         </w:tc>
@@ -543,7 +680,7 @@
       <w:tr>
         <w:tc>
           <w:tcPr>
-            <w:tcW w:type="dxa" w:w="2304"/>
+            <w:tcW w:type="dxa" w:w="2160"/>
             <w:shd w:fill="F8F9FA"/>
           </w:tcPr>
           <w:p>
@@ -563,7 +700,7 @@
         </w:tc>
         <w:tc>
           <w:tcPr>
-            <w:tcW w:type="dxa" w:w="1152"/>
+            <w:tcW w:type="dxa" w:w="1008"/>
             <w:shd w:fill="F8F9FA"/>
           </w:tcPr>
           <w:p>
@@ -583,7 +720,7 @@
         </w:tc>
         <w:tc>
           <w:tcPr>
-            <w:tcW w:type="dxa" w:w="2016"/>
+            <w:tcW w:type="dxa" w:w="1872"/>
             <w:shd w:fill="F8F9FA"/>
           </w:tcPr>
           <w:p>
@@ -603,7 +740,7 @@
         </w:tc>
         <w:tc>
           <w:tcPr>
-            <w:tcW w:type="dxa" w:w="3168"/>
+            <w:tcW w:type="dxa" w:w="2736"/>
             <w:shd w:fill="F8F9FA"/>
           </w:tcPr>
           <w:p>
@@ -618,6 +755,26 @@
                 <w:sz w:val="17"/>
               </w:rPr>
               <w:t>Bài toán thực tế, 4 mục tiêu SMART, phân tích 6 bên liên quan, vòng đời Agile/Scrum, ràng buộc</w:t>
+            </w:r>
+          </w:p>
+        </w:tc>
+        <w:tc>
+          <w:tcPr>
+            <w:tcW w:type="dxa" w:w="1440"/>
+            <w:shd w:fill="F8F9FA"/>
+          </w:tcPr>
+          <w:p>
+            <w:pPr>
+              <w:spacing w:line="252" w:lineRule="auto" w:after="40"/>
+              <w:jc w:val="center"/>
+            </w:pPr>
+            <w:r>
+              <w:rPr>
+                <w:rFonts w:ascii="Times New Roman" w:hAnsi="Times New Roman"/>
+                <w:color w:val="222222"/>
+                <w:sz w:val="17"/>
+              </w:rPr>
+              <w:t>FULLY_COVERED</w:t>
             </w:r>
           </w:p>
         </w:tc>
@@ -625,7 +782,7 @@
       <w:tr>
         <w:tc>
           <w:tcPr>
-            <w:tcW w:type="dxa" w:w="2304"/>
+            <w:tcW w:type="dxa" w:w="2160"/>
             <w:shd w:fill="FFFFFF"/>
           </w:tcPr>
           <w:p>
@@ -645,7 +802,7 @@
         </w:tc>
         <w:tc>
           <w:tcPr>
-            <w:tcW w:type="dxa" w:w="1152"/>
+            <w:tcW w:type="dxa" w:w="1008"/>
             <w:shd w:fill="FFFFFF"/>
           </w:tcPr>
           <w:p>
@@ -665,7 +822,7 @@
         </w:tc>
         <w:tc>
           <w:tcPr>
-            <w:tcW w:type="dxa" w:w="2016"/>
+            <w:tcW w:type="dxa" w:w="1872"/>
             <w:shd w:fill="FFFFFF"/>
           </w:tcPr>
           <w:p>
@@ -685,7 +842,7 @@
         </w:tc>
         <w:tc>
           <w:tcPr>
-            <w:tcW w:type="dxa" w:w="3168"/>
+            <w:tcW w:type="dxa" w:w="2736"/>
             <w:shd w:fill="FFFFFF"/>
           </w:tcPr>
           <w:p>
@@ -700,6 +857,26 @@
                 <w:sz w:val="17"/>
               </w:rPr>
               <w:t>Bản SOW chi tiết, tiêu chí nghiệm thu, WBS 3 cấp (14 gói), từ điển 5 gói tiêu biểu, quy trình &amp; case đổi phạm vi</w:t>
+            </w:r>
+          </w:p>
+        </w:tc>
+        <w:tc>
+          <w:tcPr>
+            <w:tcW w:type="dxa" w:w="1440"/>
+            <w:shd w:fill="FFFFFF"/>
+          </w:tcPr>
+          <w:p>
+            <w:pPr>
+              <w:spacing w:line="252" w:lineRule="auto" w:after="40"/>
+              <w:jc w:val="center"/>
+            </w:pPr>
+            <w:r>
+              <w:rPr>
+                <w:rFonts w:ascii="Times New Roman" w:hAnsi="Times New Roman"/>
+                <w:color w:val="222222"/>
+                <w:sz w:val="17"/>
+              </w:rPr>
+              <w:t>FULLY_COVERED</w:t>
             </w:r>
           </w:p>
         </w:tc>
@@ -707,7 +884,7 @@
       <w:tr>
         <w:tc>
           <w:tcPr>
-            <w:tcW w:type="dxa" w:w="2304"/>
+            <w:tcW w:type="dxa" w:w="2160"/>
             <w:shd w:fill="F8F9FA"/>
           </w:tcPr>
           <w:p>
@@ -727,7 +904,7 @@
         </w:tc>
         <w:tc>
           <w:tcPr>
-            <w:tcW w:type="dxa" w:w="1152"/>
+            <w:tcW w:type="dxa" w:w="1008"/>
             <w:shd w:fill="F8F9FA"/>
           </w:tcPr>
           <w:p>
@@ -747,7 +924,7 @@
         </w:tc>
         <w:tc>
           <w:tcPr>
-            <w:tcW w:type="dxa" w:w="2016"/>
+            <w:tcW w:type="dxa" w:w="1872"/>
             <w:shd w:fill="F8F9FA"/>
           </w:tcPr>
           <w:p>
@@ -761,13 +938,13 @@
                 <w:color w:val="222222"/>
                 <w:sz w:val="17"/>
               </w:rPr>
-              <w:t>Chương 3 (Trang 8-11)</w:t>
-            </w:r>
-          </w:p>
-        </w:tc>
-        <w:tc>
-          <w:tcPr>
-            <w:tcW w:type="dxa" w:w="3168"/>
+              <w:t>Chương 3 (Trang 8-10)</w:t>
+            </w:r>
+          </w:p>
+        </w:tc>
+        <w:tc>
+          <w:tcPr>
+            <w:tcW w:type="dxa" w:w="2736"/>
             <w:shd w:fill="F8F9FA"/>
           </w:tcPr>
           <w:p>
@@ -781,7 +958,27 @@
                 <w:color w:val="222222"/>
                 <w:sz w:val="17"/>
               </w:rPr>
-              <w:t>Danh mục 14 hoạt động, PERT 3 điểm, mạng PDM, CPM Forward/Backward pass, đường găng 51 ngày, Gantt, case điều chỉnh</w:t>
+              <w:t>Danh mục 14 hoạt động, PERT 3 điểm, mạng PDM, CPM Forward/Backward pass, đường găng 51 ngày, Gantt, case nén tiến độ</w:t>
+            </w:r>
+          </w:p>
+        </w:tc>
+        <w:tc>
+          <w:tcPr>
+            <w:tcW w:type="dxa" w:w="1440"/>
+            <w:shd w:fill="F8F9FA"/>
+          </w:tcPr>
+          <w:p>
+            <w:pPr>
+              <w:spacing w:line="252" w:lineRule="auto" w:after="40"/>
+              <w:jc w:val="center"/>
+            </w:pPr>
+            <w:r>
+              <w:rPr>
+                <w:rFonts w:ascii="Times New Roman" w:hAnsi="Times New Roman"/>
+                <w:color w:val="222222"/>
+                <w:sz w:val="17"/>
+              </w:rPr>
+              <w:t>FULLY_COVERED</w:t>
             </w:r>
           </w:p>
         </w:tc>
@@ -789,7 +986,7 @@
       <w:tr>
         <w:tc>
           <w:tcPr>
-            <w:tcW w:type="dxa" w:w="2304"/>
+            <w:tcW w:type="dxa" w:w="2160"/>
             <w:shd w:fill="FFFFFF"/>
           </w:tcPr>
           <w:p>
@@ -809,7 +1006,7 @@
         </w:tc>
         <w:tc>
           <w:tcPr>
-            <w:tcW w:type="dxa" w:w="1152"/>
+            <w:tcW w:type="dxa" w:w="1008"/>
             <w:shd w:fill="FFFFFF"/>
           </w:tcPr>
           <w:p>
@@ -829,7 +1026,7 @@
         </w:tc>
         <w:tc>
           <w:tcPr>
-            <w:tcW w:type="dxa" w:w="2016"/>
+            <w:tcW w:type="dxa" w:w="1872"/>
             <w:shd w:fill="FFFFFF"/>
           </w:tcPr>
           <w:p>
@@ -843,13 +1040,13 @@
                 <w:color w:val="222222"/>
                 <w:sz w:val="17"/>
               </w:rPr>
-              <w:t>Chương 4 (Trang 12-14)</w:t>
-            </w:r>
-          </w:p>
-        </w:tc>
-        <w:tc>
-          <w:tcPr>
-            <w:tcW w:type="dxa" w:w="3168"/>
+              <w:t>Chương 4 (Trang 11-13)</w:t>
+            </w:r>
+          </w:p>
+        </w:tc>
+        <w:tc>
+          <w:tcPr>
+            <w:tcW w:type="dxa" w:w="2736"/>
             <w:shd w:fill="FFFFFF"/>
           </w:tcPr>
           <w:p>
@@ -864,6 +1061,26 @@
                 <w:sz w:val="17"/>
               </w:rPr>
               <w:t>Sơ đồ tổ chức, ma trận kỹ năng, RAM/RACI 14 gói, biểu đồ tải tuần, case giải quyết quá tải, phát triển nhóm (Herzberg)</w:t>
+            </w:r>
+          </w:p>
+        </w:tc>
+        <w:tc>
+          <w:tcPr>
+            <w:tcW w:type="dxa" w:w="1440"/>
+            <w:shd w:fill="FFFFFF"/>
+          </w:tcPr>
+          <w:p>
+            <w:pPr>
+              <w:spacing w:line="252" w:lineRule="auto" w:after="40"/>
+              <w:jc w:val="center"/>
+            </w:pPr>
+            <w:r>
+              <w:rPr>
+                <w:rFonts w:ascii="Times New Roman" w:hAnsi="Times New Roman"/>
+                <w:color w:val="222222"/>
+                <w:sz w:val="17"/>
+              </w:rPr>
+              <w:t>FULLY_COVERED</w:t>
             </w:r>
           </w:p>
         </w:tc>
@@ -871,7 +1088,7 @@
       <w:tr>
         <w:tc>
           <w:tcPr>
-            <w:tcW w:type="dxa" w:w="2304"/>
+            <w:tcW w:type="dxa" w:w="2160"/>
             <w:shd w:fill="F8F9FA"/>
           </w:tcPr>
           <w:p>
@@ -891,7 +1108,7 @@
         </w:tc>
         <w:tc>
           <w:tcPr>
-            <w:tcW w:type="dxa" w:w="1152"/>
+            <w:tcW w:type="dxa" w:w="1008"/>
             <w:shd w:fill="F8F9FA"/>
           </w:tcPr>
           <w:p>
@@ -911,7 +1128,7 @@
         </w:tc>
         <w:tc>
           <w:tcPr>
-            <w:tcW w:type="dxa" w:w="2016"/>
+            <w:tcW w:type="dxa" w:w="1872"/>
             <w:shd w:fill="F8F9FA"/>
           </w:tcPr>
           <w:p>
@@ -931,7 +1148,7 @@
         </w:tc>
         <w:tc>
           <w:tcPr>
-            <w:tcW w:type="dxa" w:w="3168"/>
+            <w:tcW w:type="dxa" w:w="2736"/>
             <w:shd w:fill="F8F9FA"/>
           </w:tcPr>
           <w:p>
@@ -945,7 +1162,27 @@
                 <w:color w:val="222222"/>
                 <w:sz w:val="17"/>
               </w:rPr>
-              <w:t>Đủ file DOCX, PDF, Excel tính toán, ảnh sơ đồ nét, thống nhất mã hiệu, slide 10 trang</w:t>
+              <w:t>Đủ file DOCX, PDF, Excel tính toán, ảnh sơ đồ nét, thống nhất mã hiệu WBS/Activity, slide 10 trang</w:t>
+            </w:r>
+          </w:p>
+        </w:tc>
+        <w:tc>
+          <w:tcPr>
+            <w:tcW w:type="dxa" w:w="1440"/>
+            <w:shd w:fill="F8F9FA"/>
+          </w:tcPr>
+          <w:p>
+            <w:pPr>
+              <w:spacing w:line="252" w:lineRule="auto" w:after="40"/>
+              <w:jc w:val="center"/>
+            </w:pPr>
+            <w:r>
+              <w:rPr>
+                <w:rFonts w:ascii="Times New Roman" w:hAnsi="Times New Roman"/>
+                <w:color w:val="222222"/>
+                <w:sz w:val="17"/>
+              </w:rPr>
+              <w:t>FULLY_COVERED</w:t>
             </w:r>
           </w:p>
         </w:tc>
@@ -953,7 +1190,7 @@
       <w:tr>
         <w:tc>
           <w:tcPr>
-            <w:tcW w:type="dxa" w:w="2304"/>
+            <w:tcW w:type="dxa" w:w="2160"/>
             <w:shd w:fill="FFFFFF"/>
           </w:tcPr>
           <w:p>
@@ -973,7 +1210,7 @@
         </w:tc>
         <w:tc>
           <w:tcPr>
-            <w:tcW w:type="dxa" w:w="1152"/>
+            <w:tcW w:type="dxa" w:w="1008"/>
             <w:shd w:fill="FFFFFF"/>
           </w:tcPr>
           <w:p>
@@ -993,7 +1230,7 @@
         </w:tc>
         <w:tc>
           <w:tcPr>
-            <w:tcW w:type="dxa" w:w="2016"/>
+            <w:tcW w:type="dxa" w:w="1872"/>
             <w:shd w:fill="FFFFFF"/>
           </w:tcPr>
           <w:p>
@@ -1007,13 +1244,13 @@
                 <w:color w:val="222222"/>
                 <w:sz w:val="17"/>
               </w:rPr>
-              <w:t>Phụ lục 1..4 &amp; Thuyết trình</w:t>
-            </w:r>
-          </w:p>
-        </w:tc>
-        <w:tc>
-          <w:tcPr>
-            <w:tcW w:type="dxa" w:w="3168"/>
+              <w:t>Phụ lục 1..3 &amp; Vấn đáp</w:t>
+            </w:r>
+          </w:p>
+        </w:tc>
+        <w:tc>
+          <w:tcPr>
+            <w:tcW w:type="dxa" w:w="2736"/>
             <w:shd w:fill="FFFFFF"/>
           </w:tcPr>
           <w:p>
@@ -1027,7 +1264,27 @@
                 <w:color w:val="222222"/>
                 <w:sz w:val="17"/>
               </w:rPr>
-              <w:t>Bảng phân công nhiệm vụ, nhật ký cá nhân, 2 biên bản họp chuẩn, giải thích chính xác khi vấn đáp</w:t>
+              <w:t>Bảng phân công nhiệm vụ đề xuất, mẫu nhật ký cá nhân và biên bản họp chờ nhóm xác nhận</w:t>
+            </w:r>
+          </w:p>
+        </w:tc>
+        <w:tc>
+          <w:tcPr>
+            <w:tcW w:type="dxa" w:w="1440"/>
+            <w:shd w:fill="FFFFFF"/>
+          </w:tcPr>
+          <w:p>
+            <w:pPr>
+              <w:spacing w:line="252" w:lineRule="auto" w:after="40"/>
+              <w:jc w:val="center"/>
+            </w:pPr>
+            <w:r>
+              <w:rPr>
+                <w:rFonts w:ascii="Times New Roman" w:hAnsi="Times New Roman"/>
+                <w:color w:val="222222"/>
+                <w:sz w:val="17"/>
+              </w:rPr>
+              <w:t>TEMPLATE_ONLY</w:t>
             </w:r>
           </w:p>
         </w:tc>
@@ -1035,7 +1292,7 @@
     </w:tbl>
     <w:p>
       <w:pPr>
-        <w:spacing w:line="276" w:lineRule="auto" w:after="80"/>
+        <w:spacing w:line="276" w:lineRule="auto" w:after="60"/>
       </w:pPr>
       <w:r>
         <w:rPr>
@@ -1044,7 +1301,7 @@
           <w:color w:val="222222"/>
           <w:sz w:val="22"/>
         </w:rPr>
-        <w:t>Hồ sơ này tuân thủ nguyên tắc lập kế hoạch dự án kỹ thuật phần mềm, phân định rõ ràng giữa kế hoạch mô hình hóa (PROJECT_PLAN_MODEL) và các minh chứng lịch sử đã xác minh qua Git (HISTORICAL_EVIDENCE / RECONSTRUCTED_FROM_GIT).</w:t>
+        <w:t>Hồ sơ phân định minh bạch giữa Kế hoạch mô hình hóa học phần (PROJECT_PLAN_MODEL), Minh chứng dòng thời gian kỹ thuật Git (RECONSTRUCTED_PROJECT_TIMELINE_FROM_GIT) và Biểu mẫu nhóm cần điền thực tế (TEMPLATE_REQUIRES_TEAM_COMPLETION).</w:t>
       </w:r>
     </w:p>
     <w:p>
@@ -1055,14 +1312,14 @@
     <w:p>
       <w:pPr>
         <w:keepNext/>
-        <w:spacing w:before="240" w:after="120"/>
+        <w:spacing w:before="200" w:after="80"/>
       </w:pPr>
       <w:r>
         <w:rPr>
           <w:rFonts w:ascii="Times New Roman" w:hAnsi="Times New Roman"/>
           <w:b/>
           <w:color w:val="1B365D"/>
-          <w:sz w:val="30"/>
+          <w:sz w:val="28"/>
         </w:rPr>
         <w:t>CHƯƠNG 1: TỔNG QUAN DỰ ÁN &amp; LỰA CHỌN ĐỀ TÀI</w:t>
       </w:r>
@@ -1070,14 +1327,14 @@
     <w:p>
       <w:pPr>
         <w:keepNext/>
-        <w:spacing w:before="160" w:after="80"/>
+        <w:spacing w:before="140" w:after="60"/>
       </w:pPr>
       <w:r>
         <w:rPr>
           <w:rFonts w:ascii="Times New Roman" w:hAnsi="Times New Roman"/>
           <w:b/>
           <w:color w:val="337AB7"/>
-          <w:sz w:val="26"/>
+          <w:sz w:val="24"/>
         </w:rPr>
         <w:t>1.1. Tên Dự Án, Bối Cảnh Hiện Trạng Và Lý Do Lựa Chọn Đề Tài</w:t>
       </w:r>
@@ -1171,27 +1428,27 @@
           <w:color w:val="222222"/>
           <w:sz w:val="22"/>
         </w:rPr>
-        <w:t>Khai báo tình trạng đề tài: Dự án WorkSphere thuộc diện ĐANG TRIỂN KHAI (Active Ongoing Development Project). Nhóm đã hoàn thành phần nền tảng kiến trúc Core, CSDL và các tính năng nghiệp vụ cốt lõi; kế hoạch giữa kỳ này tập trung vào toàn bộ chu trình hoàn thiện tích hợp, đóng gói Docker, tự động hóa CI/CD, diễn tập vận hành và chuẩn bị đóng dự án. Đề tài không sao chép lại đồ án đã có từ trước.</w:t>
+        <w:t>Khai báo tình trạng đề tài: Dự án WorkSphere thuộc diện TECHNICAL_IMPLEMENTATION_SUBSTANTIALLY_COMPLETE / ACADEMIC_DOCUMENTATION_AND_ACCEPTANCE_IN_PROGRESS (Phần kỹ thuật cốt lõi đã hoàn thành; nhóm đang hoàn thiện hồ sơ học thuật, tự động hóa CI/CD, diễn tập vận hành và chuẩn bị nghiệm thu đóng dự án). Đề tài không sao chép lại đồ án cũ đã có sản phẩm.</w:t>
       </w:r>
     </w:p>
     <w:p>
       <w:pPr>
         <w:keepNext/>
-        <w:spacing w:before="160" w:after="80"/>
+        <w:spacing w:before="140" w:after="60"/>
       </w:pPr>
       <w:r>
         <w:rPr>
           <w:rFonts w:ascii="Times New Roman" w:hAnsi="Times New Roman"/>
           <w:b/>
           <w:color w:val="337AB7"/>
-          <w:sz w:val="26"/>
+          <w:sz w:val="24"/>
         </w:rPr>
         <w:t>1.2. Mục Tiêu Dự Án Đo Lường Được (Measurable SMART Objectives)</w:t>
       </w:r>
     </w:p>
     <w:p>
       <w:pPr>
-        <w:spacing w:line="276" w:lineRule="auto" w:after="80"/>
+        <w:spacing w:line="276" w:lineRule="auto" w:after="60"/>
       </w:pPr>
       <w:r>
         <w:rPr>
@@ -1298,21 +1555,21 @@
     <w:p>
       <w:pPr>
         <w:keepNext/>
-        <w:spacing w:before="160" w:after="80"/>
+        <w:spacing w:before="140" w:after="60"/>
       </w:pPr>
       <w:r>
         <w:rPr>
           <w:rFonts w:ascii="Times New Roman" w:hAnsi="Times New Roman"/>
           <w:b/>
           <w:color w:val="337AB7"/>
-          <w:sz w:val="26"/>
+          <w:sz w:val="24"/>
         </w:rPr>
         <w:t>1.3. Các Bên Liên Quan Chính (Stakeholder Register)</w:t>
       </w:r>
     </w:p>
     <w:p>
       <w:pPr>
-        <w:spacing w:line="276" w:lineRule="auto" w:after="80"/>
+        <w:spacing w:line="276" w:lineRule="auto" w:after="60"/>
       </w:pPr>
       <w:r>
         <w:rPr>
@@ -1353,7 +1610,7 @@
                 <w:rFonts w:ascii="Times New Roman" w:hAnsi="Times New Roman"/>
                 <w:b/>
                 <w:color w:val="FFFFFF"/>
-                <w:sz w:val="19"/>
+                <w:sz w:val="18"/>
               </w:rPr>
               <w:t>Bên liên quan</w:t>
             </w:r>
@@ -1373,7 +1630,7 @@
                 <w:rFonts w:ascii="Times New Roman" w:hAnsi="Times New Roman"/>
                 <w:b/>
                 <w:color w:val="FFFFFF"/>
-                <w:sz w:val="19"/>
+                <w:sz w:val="18"/>
               </w:rPr>
               <w:t>Vai trò</w:t>
             </w:r>
@@ -1393,7 +1650,7 @@
                 <w:rFonts w:ascii="Times New Roman" w:hAnsi="Times New Roman"/>
                 <w:b/>
                 <w:color w:val="FFFFFF"/>
-                <w:sz w:val="19"/>
+                <w:sz w:val="18"/>
               </w:rPr>
               <w:t>Kỳ vọng &amp; Yêu cầu chính</w:t>
             </w:r>
@@ -1413,7 +1670,7 @@
                 <w:rFonts w:ascii="Times New Roman" w:hAnsi="Times New Roman"/>
                 <w:b/>
                 <w:color w:val="FFFFFF"/>
-                <w:sz w:val="19"/>
+                <w:sz w:val="18"/>
               </w:rPr>
               <w:t>Mức độ tham gia</w:t>
             </w:r>
@@ -1433,7 +1690,7 @@
                 <w:rFonts w:ascii="Times New Roman" w:hAnsi="Times New Roman"/>
                 <w:b/>
                 <w:color w:val="FFFFFF"/>
-                <w:sz w:val="19"/>
+                <w:sz w:val="18"/>
               </w:rPr>
               <w:t>Chiến lược quản lý</w:t>
             </w:r>
@@ -2056,21 +2313,21 @@
     <w:p>
       <w:pPr>
         <w:keepNext/>
-        <w:spacing w:before="160" w:after="80"/>
+        <w:spacing w:before="140" w:after="60"/>
       </w:pPr>
       <w:r>
         <w:rPr>
           <w:rFonts w:ascii="Times New Roman" w:hAnsi="Times New Roman"/>
           <w:b/>
           <w:color w:val="337AB7"/>
-          <w:sz w:val="26"/>
+          <w:sz w:val="24"/>
         </w:rPr>
         <w:t>1.4. Lựa Chọn Mô Hình Vòng Đời Dự Án (Project Life Cycle)</w:t>
       </w:r>
     </w:p>
     <w:p>
       <w:pPr>
-        <w:spacing w:line="276" w:lineRule="auto" w:after="80"/>
+        <w:spacing w:line="276" w:lineRule="auto" w:after="60"/>
       </w:pPr>
       <w:r>
         <w:rPr>
@@ -2136,14 +2393,14 @@
     <w:p>
       <w:pPr>
         <w:keepNext/>
-        <w:spacing w:before="240" w:after="120"/>
+        <w:spacing w:before="200" w:after="80"/>
       </w:pPr>
       <w:r>
         <w:rPr>
           <w:rFonts w:ascii="Times New Roman" w:hAnsi="Times New Roman"/>
           <w:b/>
           <w:color w:val="1B365D"/>
-          <w:sz w:val="30"/>
+          <w:sz w:val="28"/>
         </w:rPr>
         <w:t>CHƯƠNG 2: QUẢN LÝ PHẠM VI DỰ ÁN (SCOPE MANAGEMENT)</w:t>
       </w:r>
@@ -2151,21 +2408,21 @@
     <w:p>
       <w:pPr>
         <w:keepNext/>
-        <w:spacing w:before="160" w:after="80"/>
+        <w:spacing w:before="140" w:after="60"/>
       </w:pPr>
       <w:r>
         <w:rPr>
           <w:rFonts w:ascii="Times New Roman" w:hAnsi="Times New Roman"/>
           <w:b/>
           <w:color w:val="337AB7"/>
-          <w:sz w:val="26"/>
+          <w:sz w:val="24"/>
         </w:rPr>
         <w:t>2.1. Bản Mô Tả Công Việc &amp; Phạm Vi Dự Án (Statement of Work - SOW)</w:t>
       </w:r>
     </w:p>
     <w:p>
       <w:pPr>
-        <w:spacing w:line="276" w:lineRule="auto" w:after="80"/>
+        <w:spacing w:line="276" w:lineRule="auto" w:after="60"/>
       </w:pPr>
       <w:r>
         <w:rPr>
@@ -2226,14 +2483,14 @@
     <w:p>
       <w:pPr>
         <w:keepNext/>
-        <w:spacing w:before="160" w:after="80"/>
+        <w:spacing w:before="140" w:after="60"/>
       </w:pPr>
       <w:r>
         <w:rPr>
           <w:rFonts w:ascii="Times New Roman" w:hAnsi="Times New Roman"/>
           <w:b/>
           <w:color w:val="337AB7"/>
-          <w:sz w:val="26"/>
+          <w:sz w:val="24"/>
         </w:rPr>
         <w:t>2.2. Điều Kiện Nghiệm Thu Cho Từng Đầu Ra Chính (Acceptance Criteria)</w:t>
       </w:r>
@@ -2265,7 +2522,7 @@
                 <w:rFonts w:ascii="Times New Roman" w:hAnsi="Times New Roman"/>
                 <w:b/>
                 <w:color w:val="FFFFFF"/>
-                <w:sz w:val="19"/>
+                <w:sz w:val="18"/>
               </w:rPr>
               <w:t>Đầu ra chính</w:t>
             </w:r>
@@ -2285,7 +2542,7 @@
                 <w:rFonts w:ascii="Times New Roman" w:hAnsi="Times New Roman"/>
                 <w:b/>
                 <w:color w:val="FFFFFF"/>
-                <w:sz w:val="19"/>
+                <w:sz w:val="18"/>
               </w:rPr>
               <w:t>Mô tả bàn giao</w:t>
             </w:r>
@@ -2305,7 +2562,7 @@
                 <w:rFonts w:ascii="Times New Roman" w:hAnsi="Times New Roman"/>
                 <w:b/>
                 <w:color w:val="FFFFFF"/>
-                <w:sz w:val="19"/>
+                <w:sz w:val="18"/>
               </w:rPr>
               <w:t>Điều kiện nghiệm thu cụ thể</w:t>
             </w:r>
@@ -2617,7 +2874,7 @@
                 <w:color w:val="222222"/>
                 <w:sz w:val="17"/>
               </w:rPr>
-              <w:t>Đầy đủ WBS 3 cấp, từ điển WBS, tính CPM không sai lệch, Gantt nhất quán, nhật ký làm việc và biên bản họp minh bạch.</w:t>
+              <w:t>Đầy đủ WBS 3 cấp, từ điển WBS, tính CPM không sai lệch, Gantt nhất quán, mẫu nhật ký làm việc và biên bản họp minh bạch.</w:t>
             </w:r>
           </w:p>
         </w:tc>
@@ -2626,21 +2883,21 @@
     <w:p>
       <w:pPr>
         <w:keepNext/>
-        <w:spacing w:before="160" w:after="80"/>
+        <w:spacing w:before="140" w:after="60"/>
       </w:pPr>
       <w:r>
         <w:rPr>
           <w:rFonts w:ascii="Times New Roman" w:hAnsi="Times New Roman"/>
           <w:b/>
           <w:color w:val="337AB7"/>
-          <w:sz w:val="26"/>
+          <w:sz w:val="24"/>
         </w:rPr>
         <w:t>2.3. Cấu Trúc Phân Rã Công Việc (WBS - Work Breakdown Structure)</w:t>
       </w:r>
     </w:p>
     <w:p>
       <w:pPr>
-        <w:spacing w:line="276" w:lineRule="auto" w:after="80"/>
+        <w:spacing w:line="276" w:lineRule="auto" w:after="60"/>
       </w:pPr>
       <w:r>
         <w:rPr>
@@ -2749,7 +3006,7 @@
                 <w:rFonts w:ascii="Times New Roman" w:hAnsi="Times New Roman"/>
                 <w:b/>
                 <w:color w:val="FFFFFF"/>
-                <w:sz w:val="19"/>
+                <w:sz w:val="18"/>
               </w:rPr>
               <w:t>Mã WBS</w:t>
             </w:r>
@@ -2769,7 +3026,7 @@
                 <w:rFonts w:ascii="Times New Roman" w:hAnsi="Times New Roman"/>
                 <w:b/>
                 <w:color w:val="FFFFFF"/>
-                <w:sz w:val="19"/>
+                <w:sz w:val="18"/>
               </w:rPr>
               <w:t>Tên Gói Công Việc (Work Package)</w:t>
             </w:r>
@@ -2789,7 +3046,7 @@
                 <w:rFonts w:ascii="Times New Roman" w:hAnsi="Times New Roman"/>
                 <w:b/>
                 <w:color w:val="FFFFFF"/>
-                <w:sz w:val="19"/>
+                <w:sz w:val="18"/>
               </w:rPr>
               <w:t>Đầu Ra Bàn Giao</w:t>
             </w:r>
@@ -2809,9 +3066,9 @@
                 <w:rFonts w:ascii="Times New Roman" w:hAnsi="Times New Roman"/>
                 <w:b/>
                 <w:color w:val="FFFFFF"/>
-                <w:sz w:val="19"/>
-              </w:rPr>
-              <w:t>Người Phụ Trách</w:t>
+                <w:sz w:val="18"/>
+              </w:rPr>
+              <w:t>Vai Trò Đề Xuất Phụ Trách</w:t>
             </w:r>
           </w:p>
         </w:tc>
@@ -2893,7 +3150,7 @@
                 <w:color w:val="222222"/>
                 <w:sz w:val="17"/>
               </w:rPr>
-              <w:t>Nguyễn Minh Hiếu</w:t>
+              <w:t>Project Manager</w:t>
             </w:r>
           </w:p>
         </w:tc>
@@ -2975,7 +3232,7 @@
                 <w:color w:val="222222"/>
                 <w:sz w:val="17"/>
               </w:rPr>
-              <w:t>Nguyễn Minh Hiếu</w:t>
+              <w:t>Project Manager</w:t>
             </w:r>
           </w:p>
         </w:tc>
@@ -3057,7 +3314,7 @@
                 <w:color w:val="222222"/>
                 <w:sz w:val="17"/>
               </w:rPr>
-              <w:t>Nguyễn Minh Hiếu</w:t>
+              <w:t>Project Manager</w:t>
             </w:r>
           </w:p>
         </w:tc>
@@ -3131,15 +3388,15 @@
           <w:p>
             <w:pPr>
               <w:spacing w:line="252" w:lineRule="auto" w:after="40"/>
-              <w:jc w:val="left"/>
-            </w:pPr>
-            <w:r>
-              <w:rPr>
-                <w:rFonts w:ascii="Times New Roman" w:hAnsi="Times New Roman"/>
-                <w:color w:val="222222"/>
-                <w:sz w:val="17"/>
-              </w:rPr>
-              <w:t>Nguyễn Văn Cường</w:t>
+              <w:jc w:val="center"/>
+            </w:pPr>
+            <w:r>
+              <w:rPr>
+                <w:rFonts w:ascii="Times New Roman" w:hAnsi="Times New Roman"/>
+                <w:color w:val="222222"/>
+                <w:sz w:val="17"/>
+              </w:rPr>
+              <w:t>Lead Architect</w:t>
             </w:r>
           </w:p>
         </w:tc>
@@ -3221,7 +3478,7 @@
                 <w:color w:val="222222"/>
                 <w:sz w:val="17"/>
               </w:rPr>
-              <w:t>Hoàng Bảo Long</w:t>
+              <w:t>Backend Lead</w:t>
             </w:r>
           </w:p>
         </w:tc>
@@ -3303,7 +3560,7 @@
                 <w:color w:val="222222"/>
                 <w:sz w:val="17"/>
               </w:rPr>
-              <w:t>Hoàng Bảo Long</w:t>
+              <w:t>Backend Lead</w:t>
             </w:r>
           </w:p>
         </w:tc>
@@ -3377,15 +3634,15 @@
           <w:p>
             <w:pPr>
               <w:spacing w:line="252" w:lineRule="auto" w:after="40"/>
-              <w:jc w:val="left"/>
-            </w:pPr>
-            <w:r>
-              <w:rPr>
-                <w:rFonts w:ascii="Times New Roman" w:hAnsi="Times New Roman"/>
-                <w:color w:val="222222"/>
-                <w:sz w:val="17"/>
-              </w:rPr>
-              <w:t>Nguyễn Văn Cường</w:t>
+              <w:jc w:val="center"/>
+            </w:pPr>
+            <w:r>
+              <w:rPr>
+                <w:rFonts w:ascii="Times New Roman" w:hAnsi="Times New Roman"/>
+                <w:color w:val="222222"/>
+                <w:sz w:val="17"/>
+              </w:rPr>
+              <w:t>Mobile Lead</w:t>
             </w:r>
           </w:p>
         </w:tc>
@@ -3459,15 +3716,15 @@
           <w:p>
             <w:pPr>
               <w:spacing w:line="252" w:lineRule="auto" w:after="40"/>
-              <w:jc w:val="left"/>
-            </w:pPr>
-            <w:r>
-              <w:rPr>
-                <w:rFonts w:ascii="Times New Roman" w:hAnsi="Times New Roman"/>
-                <w:color w:val="222222"/>
-                <w:sz w:val="17"/>
-              </w:rPr>
-              <w:t>Nguyễn Văn Cường</w:t>
+              <w:jc w:val="center"/>
+            </w:pPr>
+            <w:r>
+              <w:rPr>
+                <w:rFonts w:ascii="Times New Roman" w:hAnsi="Times New Roman"/>
+                <w:color w:val="222222"/>
+                <w:sz w:val="17"/>
+              </w:rPr>
+              <w:t>Mobile Lead</w:t>
             </w:r>
           </w:p>
         </w:tc>
@@ -3541,15 +3798,15 @@
           <w:p>
             <w:pPr>
               <w:spacing w:line="252" w:lineRule="auto" w:after="40"/>
-              <w:jc w:val="left"/>
-            </w:pPr>
-            <w:r>
-              <w:rPr>
-                <w:rFonts w:ascii="Times New Roman" w:hAnsi="Times New Roman"/>
-                <w:color w:val="222222"/>
-                <w:sz w:val="17"/>
-              </w:rPr>
-              <w:t>Vũ Thị Thu Hướng</w:t>
+              <w:jc w:val="center"/>
+            </w:pPr>
+            <w:r>
+              <w:rPr>
+                <w:rFonts w:ascii="Times New Roman" w:hAnsi="Times New Roman"/>
+                <w:color w:val="222222"/>
+                <w:sz w:val="17"/>
+              </w:rPr>
+              <w:t>QA Lead</w:t>
             </w:r>
           </w:p>
         </w:tc>
@@ -3623,15 +3880,15 @@
           <w:p>
             <w:pPr>
               <w:spacing w:line="252" w:lineRule="auto" w:after="40"/>
-              <w:jc w:val="left"/>
-            </w:pPr>
-            <w:r>
-              <w:rPr>
-                <w:rFonts w:ascii="Times New Roman" w:hAnsi="Times New Roman"/>
-                <w:color w:val="222222"/>
-                <w:sz w:val="17"/>
-              </w:rPr>
-              <w:t>Vũ Thị Thu Hướng</w:t>
+              <w:jc w:val="center"/>
+            </w:pPr>
+            <w:r>
+              <w:rPr>
+                <w:rFonts w:ascii="Times New Roman" w:hAnsi="Times New Roman"/>
+                <w:color w:val="222222"/>
+                <w:sz w:val="17"/>
+              </w:rPr>
+              <w:t>QA Lead</w:t>
             </w:r>
           </w:p>
         </w:tc>
@@ -3705,15 +3962,15 @@
           <w:p>
             <w:pPr>
               <w:spacing w:line="252" w:lineRule="auto" w:after="40"/>
-              <w:jc w:val="left"/>
-            </w:pPr>
-            <w:r>
-              <w:rPr>
-                <w:rFonts w:ascii="Times New Roman" w:hAnsi="Times New Roman"/>
-                <w:color w:val="222222"/>
-                <w:sz w:val="17"/>
-              </w:rPr>
-              <w:t>Vũ Thị Thu Hướng</w:t>
+              <w:jc w:val="center"/>
+            </w:pPr>
+            <w:r>
+              <w:rPr>
+                <w:rFonts w:ascii="Times New Roman" w:hAnsi="Times New Roman"/>
+                <w:color w:val="222222"/>
+                <w:sz w:val="17"/>
+              </w:rPr>
+              <w:t>QA Lead</w:t>
             </w:r>
           </w:p>
         </w:tc>
@@ -3795,7 +4052,7 @@
                 <w:color w:val="222222"/>
                 <w:sz w:val="17"/>
               </w:rPr>
-              <w:t>Hoàng Bảo Long</w:t>
+              <w:t>DevOps Lead</w:t>
             </w:r>
           </w:p>
         </w:tc>
@@ -3877,7 +4134,7 @@
                 <w:color w:val="222222"/>
                 <w:sz w:val="17"/>
               </w:rPr>
-              <w:t>Nguyễn Minh Hiếu</w:t>
+              <w:t>Project Manager / Ops</w:t>
             </w:r>
           </w:p>
         </w:tc>
@@ -3959,7 +4216,7 @@
                 <w:color w:val="222222"/>
                 <w:sz w:val="17"/>
               </w:rPr>
-              <w:t>Nguyễn Minh Hiếu</w:t>
+              <w:t>Project Manager</w:t>
             </w:r>
           </w:p>
         </w:tc>
@@ -3968,21 +4225,21 @@
     <w:p>
       <w:pPr>
         <w:keepNext/>
-        <w:spacing w:before="160" w:after="80"/>
+        <w:spacing w:before="140" w:after="60"/>
       </w:pPr>
       <w:r>
         <w:rPr>
           <w:rFonts w:ascii="Times New Roman" w:hAnsi="Times New Roman"/>
           <w:b/>
           <w:color w:val="337AB7"/>
-          <w:sz w:val="26"/>
+          <w:sz w:val="24"/>
         </w:rPr>
         <w:t>2.4. Từ Điển WBS Cho 5 Gói Công Việc Tiêu Biểu (WBS Dictionary)</w:t>
       </w:r>
     </w:p>
     <w:p>
       <w:pPr>
-        <w:spacing w:line="276" w:lineRule="auto" w:after="80"/>
+        <w:spacing w:line="276" w:lineRule="auto" w:after="60"/>
       </w:pPr>
       <w:r>
         <w:rPr>
@@ -4014,7 +4271,7 @@
           <w:color w:val="222222"/>
           <w:sz w:val="22"/>
         </w:rPr>
-        <w:t>Gói 2.1.2 - Thiết kế CSDL &amp; Flyway Migrations: Mô tả: Thiết kế lược đồ quan hệ chuẩn hóa 3NF cho 11 bảng dữ liệu, viết các tệp Flyway migration V1 đến V12 bảo đảm toàn vẹn dữ liệu. Đầu ra: 12 tệp SQL migrations, sơ đồ ERD. Điều kiện hoàn thành: Chạy thành công lệnh mvn flyway:migrate không có lỗi, ràng buộc khóa ngoại chính xác. Người phụ trách: Hoàng Bảo Long.</w:t>
+        <w:t>Gói 2.1.2 - Thiết kế CSDL &amp; Flyway Migrations: Mô tả: Thiết kế lược đồ quan hệ chuẩn hóa 3NF cho 11 bảng dữ liệu, viết các tệp Flyway migration V1 đến V12 bảo đảm toàn vẹn dữ liệu. Đầu ra: 12 tệp SQL migrations, sơ đồ ERD. Điều kiện hoàn thành: Chạy thành công lệnh mvn flyway:migrate không có lỗi, ràng buộc khóa ngoại chính xác. Vai trò đề xuất: Backend Lead.</w:t>
       </w:r>
     </w:p>
     <w:p>
@@ -4037,7 +4294,7 @@
           <w:color w:val="222222"/>
           <w:sz w:val="22"/>
         </w:rPr>
-        <w:t>Gói 2.2.1 - Phát triển Backend Modules: Mô tả: Lập trình các Controller, Service, Repository cho các module Auth, Identity, Project, Task, Asset. Đầu ra: Mã nguồn Java Spring Boot với hơn 25 REST endpoints. Điều kiện hoàn thành: Phản hồi đúng HTTP status (200, 201, 400, 401, 403, 404), bắt lỗi toàn cục qua ControllerAdvice. Người phụ trách: Hoàng Bảo Long.</w:t>
+        <w:t>Gói 2.2.1 - Phát triển Backend Modules: Mô tả: Lập trình các Controller, Service, Repository cho các module Auth, Identity, Project, Task, Asset. Đầu ra: Mã nguồn Java Spring Boot với hơn 25 REST endpoints. Điều kiện hoàn thành: Phản hồi đúng HTTP status (200, 201, 400, 401, 403, 404), bắt lỗi toàn cục qua ControllerAdvice. Vai trò đề xuất: Backend Lead.</w:t>
       </w:r>
     </w:p>
     <w:p>
@@ -4060,7 +4317,7 @@
           <w:color w:val="222222"/>
           <w:sz w:val="22"/>
         </w:rPr>
-        <w:t>Gói 3.1.2 - Phát triển Mobile Client: Mô tả: Xây dựng ứng dụng di động React Native 0.88, React 19, TypeScript, tổ chức 29 màn hình, quản trị token an toàn và API interceptors. Đầu ra: Mã nguồn ứng dụng di động hoàn chỉnh. Điều kiện hoàn thành: Ứng dụng điều hướng mượt mà, tải dữ liệu phân trang, không crash, lưu refresh token trong Keychain. Người phụ trách: Nguyễn Văn Cường.</w:t>
+        <w:t>Gói 3.1.2 - Phát triển Mobile Client: Mô tả: Xây dựng ứng dụng di động React Native 0.88, React 19, TypeScript, tổ chức 29 màn hình, quản trị token an toàn và API interceptors. Đầu ra: Mã nguồn ứng dụng di động hoàn chỉnh. Điều kiện hoàn thành: Ứng dụng điều hướng mượt mà, tải dữ liệu phân trang, không crash, lưu refresh token trong Keychain. Vai trò đề xuất: Mobile Lead.</w:t>
       </w:r>
     </w:p>
     <w:p>
@@ -4083,7 +4340,7 @@
           <w:color w:val="222222"/>
           <w:sz w:val="22"/>
         </w:rPr>
-        <w:t>Gói 4.1.2 - Xây dựng Mobile Jest Tests: Mô tả: Viết các kịch bản kiểm thử tự động cho reducers, custom hooks, components và navigation guards. Đầu ra: Bộ kịch bản kiểm thử trong thư mục mobile/__tests__. Điều kiện hoàn thành: Chạy lệnh npm test đạt 129 test suites / 1,144 tests PASS 100%. Người phụ trách: Vũ Thị Thu Hướng.</w:t>
+        <w:t>Gói 4.1.2 - Xây dựng Mobile Jest Tests: Mô tả: Viết các kịch bản kiểm thử tự động cho reducers, custom hooks, components và navigation guards. Đầu ra: Bộ kịch bản kiểm thử trong thư mục mobile/__tests__. Điều kiện hoàn thành: Chạy lệnh npm test đạt 129 test suites / 1,144 tests PASS 100%. Vai trò đề xuất: QA Lead.</w:t>
       </w:r>
     </w:p>
     <w:p>
@@ -4106,27 +4363,27 @@
           <w:color w:val="222222"/>
           <w:sz w:val="22"/>
         </w:rPr>
-        <w:t>Gói 5.1.1 - Đóng gói Docker &amp; Pipeline CI: Mô tả: Xây dựng Dockerfile nhiều giai đoạn, tệp cấu hình docker-compose.yml và pipeline GitHub Actions tự động kiểm tra cú pháp và build. Đầu ra: Docker Compose stack và file workflow YAML. Điều kiện hoàn thành: Khởi động sạch các container chỉ bằng một lệnh, CI tự động vượt qua. Người phụ trách: Hoàng Bảo Long.</w:t>
+        <w:t>Gói 5.1.1 - Đóng gói Docker &amp; Pipeline CI: Mô tả: Xây dựng Dockerfile nhiều giai đoạn, tệp cấu hình docker-compose.yml và pipeline GitHub Actions tự động kiểm tra cú pháp và build. Đầu ra: Docker Compose stack và file workflow YAML. Điều kiện hoàn thành: Khởi động sạch các container chỉ bằng một lệnh, CI tự động vượt qua. Vai trò đề xuất: DevOps Lead.</w:t>
       </w:r>
     </w:p>
     <w:p>
       <w:pPr>
         <w:keepNext/>
-        <w:spacing w:before="160" w:after="80"/>
+        <w:spacing w:before="140" w:after="60"/>
       </w:pPr>
       <w:r>
         <w:rPr>
           <w:rFonts w:ascii="Times New Roman" w:hAnsi="Times New Roman"/>
           <w:b/>
           <w:color w:val="337AB7"/>
-          <w:sz w:val="26"/>
+          <w:sz w:val="24"/>
         </w:rPr>
         <w:t>2.5. Quy Trình Quản Lý Thay Đổi Phạm Vi (Scope Change Control)</w:t>
       </w:r>
     </w:p>
     <w:p>
       <w:pPr>
-        <w:spacing w:line="276" w:lineRule="auto" w:after="80"/>
+        <w:spacing w:line="276" w:lineRule="auto" w:after="60"/>
       </w:pPr>
       <w:r>
         <w:rPr>
@@ -4181,7 +4438,7 @@
           <w:color w:val="222222"/>
           <w:sz w:val="22"/>
         </w:rPr>
-        <w:t>Bước 2 (Đánh giá tác động): Trưởng nhóm (PM) chủ trì đánh giá tác động của thay đổi đối với 3 yếu tố tam giác quản lý: Phạm vi, Tiến độ (Critical path) và Nhân sự.</w:t>
+        <w:t>Bước 2 (Đánh giá tác động): Trưởng nhóm chủ trì đánh giá tác động của thay đổi đối với 3 yếu tố tam giác quản lý: Phạm vi, Tiến độ (Critical path) và Nhân sự.</w:t>
       </w:r>
     </w:p>
     <w:p>
@@ -4255,7 +4512,7 @@
     </w:p>
     <w:p>
       <w:pPr>
-        <w:spacing w:line="276" w:lineRule="auto" w:after="80"/>
+        <w:spacing w:line="276" w:lineRule="auto" w:after="60"/>
       </w:pPr>
       <w:r>
         <w:rPr>
@@ -4264,7 +4521,7 @@
           <w:color w:val="222222"/>
           <w:sz w:val="22"/>
         </w:rPr>
-        <w:t>Ví dụ tình huống thực tế của dự án: Trong quá trình phát triển phân hệ Di động, nhóm nhận thấy nhu cầu cấp thiết phải bổ sung chức năng Lịch sử sửa chữa tài sản (Asset Repair History) để phục vụ quy trình bảo trì. Trưởng nhóm cùng Mobile Lead và Backend Lead đã họp đánh giá: yêu cầu này bổ sung 1 endpoint Backend và 1 màn hình con Mobile, tiêu tốn thêm 2 ngày công. Do gói công việc này có độ dự trữ toàn phần (Float = 2 ngày), nhóm đã phê duyệt và tích hợp thành công mà không làm ảnh hưởng đến ngày hoàn thành chung của dự án.</w:t>
+        <w:t>Ví dụ tình huống thực tế của dự án [PROJECT_PLAN_MODEL / RECONSTRUCTED_FROM_GIT]: Trong quá trình phát triển phân hệ Di động, nhóm nhận thấy nhu cầu cấp thiết phải bổ sung chức năng Lịch sử sửa chữa tài sản (Asset Repair History) để phục vụ quy trình bảo trì. Nhóm đã họp đánh giá: yêu cầu này bổ sung 1 endpoint Backend và 1 màn hình con Mobile, tiêu tốn thêm 2 ngày công. Do gói công việc này có độ dự trữ toàn phần (Float = 2 ngày), nhóm đã phê duyệt và tích hợp thành công mà không làm ảnh hưởng đến ngày hoàn thành chung của dự án.</w:t>
       </w:r>
     </w:p>
     <w:p>
@@ -4275,14 +4532,14 @@
     <w:p>
       <w:pPr>
         <w:keepNext/>
-        <w:spacing w:before="240" w:after="120"/>
+        <w:spacing w:before="200" w:after="80"/>
       </w:pPr>
       <w:r>
         <w:rPr>
           <w:rFonts w:ascii="Times New Roman" w:hAnsi="Times New Roman"/>
           <w:b/>
           <w:color w:val="1B365D"/>
-          <w:sz w:val="30"/>
+          <w:sz w:val="28"/>
         </w:rPr>
         <w:t>CHƯƠNG 3: QUẢN LÝ TIẾN ĐỘ DỰ ÁN (TIME MANAGEMENT)</w:t>
       </w:r>
@@ -4290,22 +4547,31 @@
     <w:p>
       <w:pPr>
         <w:keepNext/>
-        <w:spacing w:before="160" w:after="80"/>
+        <w:spacing w:before="140" w:after="60"/>
       </w:pPr>
       <w:r>
         <w:rPr>
           <w:rFonts w:ascii="Times New Roman" w:hAnsi="Times New Roman"/>
           <w:b/>
           <w:color w:val="337AB7"/>
-          <w:sz w:val="26"/>
+          <w:sz w:val="24"/>
         </w:rPr>
-        <w:t>3.1. Danh Mục Hoạt Động, Quan Hệ Phụ Thuộc &amp; Ước Lượng PERT</w:t>
+        <w:t>3.1. Danh Mục Hoạt Động, Tiền Nhiệm &amp; Ước Lượng PERT 3 Điểm</w:t>
       </w:r>
     </w:p>
     <w:p>
       <w:pPr>
-        <w:spacing w:line="276" w:lineRule="auto" w:after="80"/>
+        <w:spacing w:line="276" w:lineRule="auto" w:after="60"/>
       </w:pPr>
+      <w:r>
+        <w:rPr>
+          <w:rFonts w:ascii="Times New Roman" w:hAnsi="Times New Roman"/>
+          <w:b/>
+          <w:color w:val="884400"/>
+          <w:sz w:val="19"/>
+        </w:rPr>
+        <w:t xml:space="preserve">[PROJECT_PLAN_MODEL] </w:t>
+      </w:r>
       <w:r>
         <w:rPr>
           <w:rFonts w:ascii="Times New Roman" w:hAnsi="Times New Roman"/>
@@ -4313,12 +4579,12 @@
           <w:color w:val="222222"/>
           <w:sz w:val="22"/>
         </w:rPr>
-        <w:t>Từ 14 gói công việc WBS, nhóm xác lập 14 hoạt động tiến độ tương ứng. Để khắc phục sự không chắc chắn trong ước lượng kỹ thuật phần mềm, nhóm áp dụng phương pháp ước lượng 3 điểm PERT (Program Evaluation and Review Technique) theo công thức chuẩn:</w:t>
+        <w:t>Từ 14 gói công việc WBS, nhóm xác lập 14 hoạt động tiến độ tương ứng. Để khắc phục sự không chắc chắn trong ước lượng kỹ thuật phần mềm, nhóm áp dụng phương pháp ước lượng 3 điểm PERT [PROJECT_PLAN_MODEL] theo công thức chuẩn:</w:t>
       </w:r>
     </w:p>
     <w:p>
       <w:pPr>
-        <w:spacing w:line="276" w:lineRule="auto" w:after="80"/>
+        <w:spacing w:line="276" w:lineRule="auto" w:after="60"/>
       </w:pPr>
       <w:r>
         <w:rPr>
@@ -4372,7 +4638,7 @@
                 <w:rFonts w:ascii="Times New Roman" w:hAnsi="Times New Roman"/>
                 <w:b/>
                 <w:color w:val="FFFFFF"/>
-                <w:sz w:val="19"/>
+                <w:sz w:val="18"/>
               </w:rPr>
               <w:t>Mã HĐ</w:t>
             </w:r>
@@ -4392,7 +4658,7 @@
                 <w:rFonts w:ascii="Times New Roman" w:hAnsi="Times New Roman"/>
                 <w:b/>
                 <w:color w:val="FFFFFF"/>
-                <w:sz w:val="19"/>
+                <w:sz w:val="18"/>
               </w:rPr>
               <w:t>WBS</w:t>
             </w:r>
@@ -4412,7 +4678,7 @@
                 <w:rFonts w:ascii="Times New Roman" w:hAnsi="Times New Roman"/>
                 <w:b/>
                 <w:color w:val="FFFFFF"/>
-                <w:sz w:val="19"/>
+                <w:sz w:val="18"/>
               </w:rPr>
               <w:t>Tên Hoạt Động</w:t>
             </w:r>
@@ -4432,7 +4698,7 @@
                 <w:rFonts w:ascii="Times New Roman" w:hAnsi="Times New Roman"/>
                 <w:b/>
                 <w:color w:val="FFFFFF"/>
-                <w:sz w:val="19"/>
+                <w:sz w:val="18"/>
               </w:rPr>
               <w:t>Tiền Nhiệm</w:t>
             </w:r>
@@ -4452,7 +4718,7 @@
                 <w:rFonts w:ascii="Times New Roman" w:hAnsi="Times New Roman"/>
                 <w:b/>
                 <w:color w:val="FFFFFF"/>
-                <w:sz w:val="19"/>
+                <w:sz w:val="18"/>
               </w:rPr>
               <w:t>O</w:t>
             </w:r>
@@ -4472,7 +4738,7 @@
                 <w:rFonts w:ascii="Times New Roman" w:hAnsi="Times New Roman"/>
                 <w:b/>
                 <w:color w:val="FFFFFF"/>
-                <w:sz w:val="19"/>
+                <w:sz w:val="18"/>
               </w:rPr>
               <w:t>M</w:t>
             </w:r>
@@ -4492,7 +4758,7 @@
                 <w:rFonts w:ascii="Times New Roman" w:hAnsi="Times New Roman"/>
                 <w:b/>
                 <w:color w:val="FFFFFF"/>
-                <w:sz w:val="19"/>
+                <w:sz w:val="18"/>
               </w:rPr>
               <w:t>P</w:t>
             </w:r>
@@ -4512,7 +4778,7 @@
                 <w:rFonts w:ascii="Times New Roman" w:hAnsi="Times New Roman"/>
                 <w:b/>
                 <w:color w:val="FFFFFF"/>
-                <w:sz w:val="19"/>
+                <w:sz w:val="18"/>
               </w:rPr>
               <w:t>TE</w:t>
             </w:r>
@@ -4532,7 +4798,7 @@
                 <w:rFonts w:ascii="Times New Roman" w:hAnsi="Times New Roman"/>
                 <w:b/>
                 <w:color w:val="FFFFFF"/>
-                <w:sz w:val="19"/>
+                <w:sz w:val="18"/>
               </w:rPr>
               <w:t>Var</w:t>
             </w:r>
@@ -7091,22 +7357,31 @@
     <w:p>
       <w:pPr>
         <w:keepNext/>
-        <w:spacing w:before="160" w:after="80"/>
+        <w:spacing w:before="140" w:after="60"/>
       </w:pPr>
       <w:r>
         <w:rPr>
           <w:rFonts w:ascii="Times New Roman" w:hAnsi="Times New Roman"/>
           <w:b/>
           <w:color w:val="337AB7"/>
-          <w:sz w:val="26"/>
+          <w:sz w:val="24"/>
         </w:rPr>
         <w:t>3.2. Sơ Đồ Mạng PDM &amp; Tính Toán Đường Găng (CPM Analysis)</w:t>
       </w:r>
     </w:p>
     <w:p>
       <w:pPr>
-        <w:spacing w:line="276" w:lineRule="auto" w:after="80"/>
+        <w:spacing w:line="276" w:lineRule="auto" w:after="60"/>
       </w:pPr>
+      <w:r>
+        <w:rPr>
+          <w:rFonts w:ascii="Times New Roman" w:hAnsi="Times New Roman"/>
+          <w:b/>
+          <w:color w:val="884400"/>
+          <w:sz w:val="19"/>
+        </w:rPr>
+        <w:t xml:space="preserve">[PROJECT_PLAN_MODEL] </w:t>
+      </w:r>
       <w:r>
         <w:rPr>
           <w:rFonts w:ascii="Times New Roman" w:hAnsi="Times New Roman"/>
@@ -7114,7 +7389,7 @@
           <w:color w:val="222222"/>
           <w:sz w:val="22"/>
         </w:rPr>
-        <w:t>Bảng tính toán chi tiết phương pháp đường găng CPM (Critical Path Method) qua hai lượt tính xuôi (Forward Pass: ES, EF) và tính ngược (Backward Pass: LS, LF), xác định độ dự trữ toàn phần (Total Float / Slack = LF - EF = LS - ES):</w:t>
+        <w:t>Bảng tính toán chi tiết phương pháp đường găng CPM [PROJECT_PLAN_MODEL] qua hai lượt tính xuôi (Forward Pass: ES, EF) và tính ngược (Backward Pass: LS, LF), xác định độ dự trữ toàn phần (Total Float / Slack = LF - EF = LS - ES):</w:t>
       </w:r>
     </w:p>
     <w:tbl>
@@ -7149,7 +7424,7 @@
                 <w:rFonts w:ascii="Times New Roman" w:hAnsi="Times New Roman"/>
                 <w:b/>
                 <w:color w:val="FFFFFF"/>
-                <w:sz w:val="19"/>
+                <w:sz w:val="18"/>
               </w:rPr>
               <w:t>Mã HĐ</w:t>
             </w:r>
@@ -7169,7 +7444,7 @@
                 <w:rFonts w:ascii="Times New Roman" w:hAnsi="Times New Roman"/>
                 <w:b/>
                 <w:color w:val="FFFFFF"/>
-                <w:sz w:val="19"/>
+                <w:sz w:val="18"/>
               </w:rPr>
               <w:t>Tên Hoạt Động</w:t>
             </w:r>
@@ -7189,7 +7464,7 @@
                 <w:rFonts w:ascii="Times New Roman" w:hAnsi="Times New Roman"/>
                 <w:b/>
                 <w:color w:val="FFFFFF"/>
-                <w:sz w:val="19"/>
+                <w:sz w:val="18"/>
               </w:rPr>
               <w:t>Thời Lượng</w:t>
             </w:r>
@@ -7209,7 +7484,7 @@
                 <w:rFonts w:ascii="Times New Roman" w:hAnsi="Times New Roman"/>
                 <w:b/>
                 <w:color w:val="FFFFFF"/>
-                <w:sz w:val="19"/>
+                <w:sz w:val="18"/>
               </w:rPr>
               <w:t>ES</w:t>
             </w:r>
@@ -7229,7 +7504,7 @@
                 <w:rFonts w:ascii="Times New Roman" w:hAnsi="Times New Roman"/>
                 <w:b/>
                 <w:color w:val="FFFFFF"/>
-                <w:sz w:val="19"/>
+                <w:sz w:val="18"/>
               </w:rPr>
               <w:t>EF</w:t>
             </w:r>
@@ -7249,7 +7524,7 @@
                 <w:rFonts w:ascii="Times New Roman" w:hAnsi="Times New Roman"/>
                 <w:b/>
                 <w:color w:val="FFFFFF"/>
-                <w:sz w:val="19"/>
+                <w:sz w:val="18"/>
               </w:rPr>
               <w:t>LS</w:t>
             </w:r>
@@ -7269,7 +7544,7 @@
                 <w:rFonts w:ascii="Times New Roman" w:hAnsi="Times New Roman"/>
                 <w:b/>
                 <w:color w:val="FFFFFF"/>
-                <w:sz w:val="19"/>
+                <w:sz w:val="18"/>
               </w:rPr>
               <w:t>LF</w:t>
             </w:r>
@@ -7289,7 +7564,7 @@
                 <w:rFonts w:ascii="Times New Roman" w:hAnsi="Times New Roman"/>
                 <w:b/>
                 <w:color w:val="FFFFFF"/>
-                <w:sz w:val="19"/>
+                <w:sz w:val="18"/>
               </w:rPr>
               <w:t>Slack</w:t>
             </w:r>
@@ -9567,7 +9842,7 @@
     </w:tbl>
     <w:p>
       <w:pPr>
-        <w:spacing w:line="276" w:lineRule="auto" w:after="80"/>
+        <w:spacing w:line="276" w:lineRule="auto" w:after="60"/>
       </w:pPr>
       <w:r>
         <w:rPr>
@@ -9660,22 +9935,31 @@
     <w:p>
       <w:pPr>
         <w:keepNext/>
-        <w:spacing w:before="160" w:after="80"/>
+        <w:spacing w:before="140" w:after="60"/>
       </w:pPr>
       <w:r>
         <w:rPr>
           <w:rFonts w:ascii="Times New Roman" w:hAnsi="Times New Roman"/>
           <w:b/>
           <w:color w:val="337AB7"/>
-          <w:sz w:val="26"/>
+          <w:sz w:val="24"/>
         </w:rPr>
         <w:t>3.3. Biểu Đồ Gantt Lập Kế Hoạch Dự Án (Gantt Chart)</w:t>
       </w:r>
     </w:p>
     <w:p>
       <w:pPr>
-        <w:spacing w:line="276" w:lineRule="auto" w:after="80"/>
+        <w:spacing w:line="276" w:lineRule="auto" w:after="60"/>
       </w:pPr>
+      <w:r>
+        <w:rPr>
+          <w:rFonts w:ascii="Times New Roman" w:hAnsi="Times New Roman"/>
+          <w:b/>
+          <w:color w:val="884400"/>
+          <w:sz w:val="19"/>
+        </w:rPr>
+        <w:t xml:space="preserve">[PROJECT_PLAN_MODEL] </w:t>
+      </w:r>
       <w:r>
         <w:rPr>
           <w:rFonts w:ascii="Times New Roman" w:hAnsi="Times New Roman"/>
@@ -9683,7 +9967,7 @@
           <w:color w:val="222222"/>
           <w:sz w:val="22"/>
         </w:rPr>
-        <w:t>Biểu đồ Gantt trực quan hóa tiến độ 14 hoạt động, thể hiện rõ các hoạt động găng (màu đỏ) và các hoạt động có độ dự trữ (màu xanh):</w:t>
+        <w:t>Biểu đồ Gantt trực quan hóa tiến độ 14 hoạt động, thể hiện rõ các hoạt động găng (màu đỏ) và các hoạt động có độ dự trữ (màu xanh) [PROJECT_PLAN_MODEL]:</w:t>
       </w:r>
     </w:p>
     <w:p>
@@ -9738,22 +10022,31 @@
     <w:p>
       <w:pPr>
         <w:keepNext/>
-        <w:spacing w:before="160" w:after="80"/>
+        <w:spacing w:before="140" w:after="60"/>
       </w:pPr>
       <w:r>
         <w:rPr>
           <w:rFonts w:ascii="Times New Roman" w:hAnsi="Times New Roman"/>
           <w:b/>
           <w:color w:val="337AB7"/>
-          <w:sz w:val="26"/>
+          <w:sz w:val="24"/>
         </w:rPr>
         <w:t>3.4. Tình Huống Điều Chỉnh Tiến Độ (Schedule Compression Scenario)</w:t>
       </w:r>
     </w:p>
     <w:p>
       <w:pPr>
-        <w:spacing w:line="276" w:lineRule="auto" w:after="80"/>
+        <w:spacing w:line="276" w:lineRule="auto" w:after="60"/>
       </w:pPr>
+      <w:r>
+        <w:rPr>
+          <w:rFonts w:ascii="Times New Roman" w:hAnsi="Times New Roman"/>
+          <w:b/>
+          <w:color w:val="884400"/>
+          <w:sz w:val="19"/>
+        </w:rPr>
+        <w:t xml:space="preserve">[PROJECT_PLAN_MODEL] </w:t>
+      </w:r>
       <w:r>
         <w:rPr>
           <w:rFonts w:ascii="Times New Roman" w:hAnsi="Times New Roman"/>
@@ -9761,7 +10054,7 @@
           <w:color w:val="222222"/>
           <w:sz w:val="22"/>
         </w:rPr>
-        <w:t>Tình huống giả định: Tại ngày thứ 28 của dự án, hoạt động ACT-08 (Phát triển Mobile Client) bị chậm 3 ngày so với kế hoạch ban đầu (thời gian thực hiện kéo dài từ 14 ngày lên 17 ngày) do phát sinh lỗi tương thích thư viện React Native Keychain trên môi trường Android mới.</w:t>
+        <w:t>Tình huống giả định [PROJECT_PLAN_MODEL]: Tại ngày thứ 28 của dự án, hoạt động ACT-08 (Phát triển Mobile Client) bị chậm 3 ngày so với kế hoạch ban đầu (thời gian thực hiện kéo dài từ 14 ngày lên 17 ngày) do phát sinh lỗi tương thích thư viện React Native Keychain trên môi trường Android mới.</w:t>
       </w:r>
     </w:p>
     <w:p>
@@ -9887,14 +10180,14 @@
     <w:p>
       <w:pPr>
         <w:keepNext/>
-        <w:spacing w:before="240" w:after="120"/>
+        <w:spacing w:before="200" w:after="80"/>
       </w:pPr>
       <w:r>
         <w:rPr>
           <w:rFonts w:ascii="Times New Roman" w:hAnsi="Times New Roman"/>
           <w:b/>
           <w:color w:val="1B365D"/>
-          <w:sz w:val="30"/>
+          <w:sz w:val="28"/>
         </w:rPr>
         <w:t>CHƯƠNG 4: QUẢN LÝ NHÂN SỰ DỰ ÁN (HUMAN RESOURCE MANAGEMENT)</w:t>
       </w:r>
@@ -9902,22 +10195,31 @@
     <w:p>
       <w:pPr>
         <w:keepNext/>
-        <w:spacing w:before="160" w:after="80"/>
+        <w:spacing w:before="140" w:after="60"/>
       </w:pPr>
       <w:r>
         <w:rPr>
           <w:rFonts w:ascii="Times New Roman" w:hAnsi="Times New Roman"/>
           <w:b/>
           <w:color w:val="337AB7"/>
-          <w:sz w:val="26"/>
+          <w:sz w:val="24"/>
         </w:rPr>
         <w:t>4.1. Cơ Cấu Tổ Chức Nhóm &amp; Ma Trận Kỹ Năng (Skills Matrix)</w:t>
       </w:r>
     </w:p>
     <w:p>
       <w:pPr>
-        <w:spacing w:line="276" w:lineRule="auto" w:after="80"/>
+        <w:spacing w:line="276" w:lineRule="auto" w:after="60"/>
       </w:pPr>
+      <w:r>
+        <w:rPr>
+          <w:rFonts w:ascii="Times New Roman" w:hAnsi="Times New Roman"/>
+          <w:b/>
+          <w:color w:val="884400"/>
+          <w:sz w:val="19"/>
+        </w:rPr>
+        <w:t xml:space="preserve">[PROPOSED_PROJECT_ROLE] </w:t>
+      </w:r>
       <w:r>
         <w:rPr>
           <w:rFonts w:ascii="Times New Roman" w:hAnsi="Times New Roman"/>
@@ -9925,7 +10227,7 @@
           <w:color w:val="222222"/>
           <w:sz w:val="22"/>
         </w:rPr>
-        <w:t>Đội ngũ thực hiện dự án gồm 4 thành viên chính thức với sự phân định vai trò chuyên môn rõ ràng:</w:t>
+        <w:t>Đội ngũ thực hiện dự án gồm 4 thành viên chính thức với sự phân định vai trò chuyên môn đề xuất [PROPOSED_PROJECT_ROLE]:</w:t>
       </w:r>
     </w:p>
     <w:p>
@@ -9948,7 +10250,7 @@
           <w:color w:val="222222"/>
           <w:sz w:val="22"/>
         </w:rPr>
-        <w:t>Nguyễn Minh Hiếu (BIT247729): Nhóm trưởng / Quản lý Dự án (Project Manager). Chịu trách nhiệm điều phối tổng thể phạm vi, tiến độ, rủi ro, chủ trì họp nhóm và hoàn thiện hồ sơ nghiệm thu kỹ thuật.</w:t>
+        <w:t>Nguyễn Minh Hiếu (BIT247729): Nhóm trưởng chính thức của môn / Đề xuất vai trò Project Manager. Chịu trách nhiệm điều phối tổng thể phạm vi, tiến độ, rủi ro, chủ trì họp nhóm và hoàn thiện hồ sơ nghiệm thu kỹ thuật.</w:t>
       </w:r>
     </w:p>
     <w:p>
@@ -9971,7 +10273,7 @@
           <w:color w:val="222222"/>
           <w:sz w:val="22"/>
         </w:rPr>
-        <w:t>Nguyễn Văn Cường (BIT240048): Kiến trúc sư Trưởng / Trưởng nhóm Di động (Lead Architect &amp; Mobile Lead). Phụ trách kiến trúc hệ thống, API Contract và phát triển toàn bộ ứng dụng di động React Native.</w:t>
+        <w:t>Nguyễn Văn Cường (BIT240048): Thành viên / Đề xuất vai trò Lead Architect &amp; Mobile Lead. Phụ trách kiến trúc hệ thống, API Contract và phát triển ứng dụng di động React Native.</w:t>
       </w:r>
     </w:p>
     <w:p>
@@ -9994,7 +10296,7 @@
           <w:color w:val="222222"/>
           <w:sz w:val="22"/>
         </w:rPr>
-        <w:t>Hoàng Bảo Long (BIT240142): Trưởng nhóm Backend &amp; DevOps (Backend Lead &amp; DevOps). Phụ trách mô hình CSDL quan hệ, lập trình các dịch vụ Spring Boot và đóng gói hệ thống qua Docker Compose / CI.</w:t>
+        <w:t>Hoàng Bảo Long (BIT240142): Thành viên / Đề xuất vai trò Backend Lead &amp; DevOps. Phụ trách mô hình CSDL quan hệ, lập trình các dịch vụ Spring Boot và đóng gói hệ thống qua Docker Compose / CI.</w:t>
       </w:r>
     </w:p>
     <w:p>
@@ -10017,12 +10319,12 @@
           <w:color w:val="222222"/>
           <w:sz w:val="22"/>
         </w:rPr>
-        <w:t>Vũ Thị Thu Hướng (BIT240113): Trưởng nhóm Đảm bảo Chất lượng (QA &amp; Test Lead). Chịu trách nhiệm thiết kế kịch bản kiểm thử, phát triển bộ 1,144 Jest tests và kiểm thử tích hợp End-to-End.</w:t>
+        <w:t>Vũ Thị Thu Hướng (BIT240113): Thành viên / Đề xuất vai trò QA &amp; Test Lead. Chịu trách nhiệm thiết kế kịch bản kiểm thử, phát triển bộ 1,144 Jest tests và kiểm thử tích hợp End-to-End.</w:t>
       </w:r>
     </w:p>
     <w:p>
       <w:pPr>
-        <w:spacing w:line="276" w:lineRule="auto" w:after="80"/>
+        <w:spacing w:line="276" w:lineRule="auto" w:after="60"/>
       </w:pPr>
       <w:r>
         <w:rPr>
@@ -10063,7 +10365,7 @@
                 <w:rFonts w:ascii="Times New Roman" w:hAnsi="Times New Roman"/>
                 <w:b/>
                 <w:color w:val="FFFFFF"/>
-                <w:sz w:val="19"/>
+                <w:sz w:val="18"/>
               </w:rPr>
               <w:t>Lĩnh vực kỹ năng chuyên môn</w:t>
             </w:r>
@@ -10083,7 +10385,7 @@
                 <w:rFonts w:ascii="Times New Roman" w:hAnsi="Times New Roman"/>
                 <w:b/>
                 <w:color w:val="FFFFFF"/>
-                <w:sz w:val="19"/>
+                <w:sz w:val="18"/>
               </w:rPr>
               <w:t>Nguyễn Minh Hiếu</w:t>
             </w:r>
@@ -10103,7 +10405,7 @@
                 <w:rFonts w:ascii="Times New Roman" w:hAnsi="Times New Roman"/>
                 <w:b/>
                 <w:color w:val="FFFFFF"/>
-                <w:sz w:val="19"/>
+                <w:sz w:val="18"/>
               </w:rPr>
               <w:t>Nguyễn Văn Cường</w:t>
             </w:r>
@@ -10123,7 +10425,7 @@
                 <w:rFonts w:ascii="Times New Roman" w:hAnsi="Times New Roman"/>
                 <w:b/>
                 <w:color w:val="FFFFFF"/>
-                <w:sz w:val="19"/>
+                <w:sz w:val="18"/>
               </w:rPr>
               <w:t>Hoàng Bảo Long</w:t>
             </w:r>
@@ -10143,7 +10445,7 @@
                 <w:rFonts w:ascii="Times New Roman" w:hAnsi="Times New Roman"/>
                 <w:b/>
                 <w:color w:val="FFFFFF"/>
-                <w:sz w:val="19"/>
+                <w:sz w:val="18"/>
               </w:rPr>
               <w:t>Vũ Thị Thu Hướng</w:t>
             </w:r>
@@ -10766,22 +11068,31 @@
     <w:p>
       <w:pPr>
         <w:keepNext/>
-        <w:spacing w:before="160" w:after="80"/>
+        <w:spacing w:before="140" w:after="60"/>
       </w:pPr>
       <w:r>
         <w:rPr>
           <w:rFonts w:ascii="Times New Roman" w:hAnsi="Times New Roman"/>
           <w:b/>
           <w:color w:val="337AB7"/>
-          <w:sz w:val="26"/>
+          <w:sz w:val="24"/>
         </w:rPr>
         <w:t>4.2. Ma Trận Phân Công Trách Nhiệm (RACI Matrix)</w:t>
       </w:r>
     </w:p>
     <w:p>
       <w:pPr>
-        <w:spacing w:line="276" w:lineRule="auto" w:after="80"/>
+        <w:spacing w:line="276" w:lineRule="auto" w:after="60"/>
       </w:pPr>
+      <w:r>
+        <w:rPr>
+          <w:rFonts w:ascii="Times New Roman" w:hAnsi="Times New Roman"/>
+          <w:b/>
+          <w:color w:val="884400"/>
+          <w:sz w:val="19"/>
+        </w:rPr>
+        <w:t xml:space="preserve">[PROJECT_PLAN_MODEL] </w:t>
+      </w:r>
       <w:r>
         <w:rPr>
           <w:rFonts w:ascii="Times New Roman" w:hAnsi="Times New Roman"/>
@@ -10789,7 +11100,7 @@
           <w:color w:val="222222"/>
           <w:sz w:val="22"/>
         </w:rPr>
-        <w:t>Ma trận RACI phân định rõ trách nhiệm cho 14 gói công việc WBS. Tuân thủ nguyên tắc: Mỗi gói công việc có đúng 1 người chịu trách nhiệm giải trình cuối cùng (Accountable - A) và ít nhất 1 người thực hiện chính (Responsible - R):</w:t>
+        <w:t>Ma trận RACI phân định rõ trách nhiệm cho 14 gói công việc WBS. Tuân thủ nguyên tắc: Mỗi gói công việc có đúng 1 người chịu trách nhiệm giải trình cuối cùng (Accountable - A) và ít nhất 1 người thực hiện chính (Responsible - R) [PROJECT_PLAN_MODEL]:</w:t>
       </w:r>
     </w:p>
     <w:tbl>
@@ -10821,7 +11132,7 @@
                 <w:rFonts w:ascii="Times New Roman" w:hAnsi="Times New Roman"/>
                 <w:b/>
                 <w:color w:val="FFFFFF"/>
-                <w:sz w:val="19"/>
+                <w:sz w:val="18"/>
               </w:rPr>
               <w:t>Gói Công Việc WBS</w:t>
             </w:r>
@@ -10841,7 +11152,7 @@
                 <w:rFonts w:ascii="Times New Roman" w:hAnsi="Times New Roman"/>
                 <w:b/>
                 <w:color w:val="FFFFFF"/>
-                <w:sz w:val="19"/>
+                <w:sz w:val="18"/>
               </w:rPr>
               <w:t>Nguyễn Minh Hiếu (PM)</w:t>
             </w:r>
@@ -10861,7 +11172,7 @@
                 <w:rFonts w:ascii="Times New Roman" w:hAnsi="Times New Roman"/>
                 <w:b/>
                 <w:color w:val="FFFFFF"/>
-                <w:sz w:val="19"/>
+                <w:sz w:val="18"/>
               </w:rPr>
               <w:t>Nguyễn Văn Cường (Mobile)</w:t>
             </w:r>
@@ -10881,7 +11192,7 @@
                 <w:rFonts w:ascii="Times New Roman" w:hAnsi="Times New Roman"/>
                 <w:b/>
                 <w:color w:val="FFFFFF"/>
-                <w:sz w:val="19"/>
+                <w:sz w:val="18"/>
               </w:rPr>
               <w:t>Hoàng Bảo Long (Backend)</w:t>
             </w:r>
@@ -10901,7 +11212,7 @@
                 <w:rFonts w:ascii="Times New Roman" w:hAnsi="Times New Roman"/>
                 <w:b/>
                 <w:color w:val="FFFFFF"/>
-                <w:sz w:val="19"/>
+                <w:sz w:val="18"/>
               </w:rPr>
               <w:t>Vũ Thị Thu Hướng (QA)</w:t>
             </w:r>
@@ -12340,22 +12651,31 @@
     <w:p>
       <w:pPr>
         <w:keepNext/>
-        <w:spacing w:before="160" w:after="80"/>
+        <w:spacing w:before="140" w:after="60"/>
       </w:pPr>
       <w:r>
         <w:rPr>
           <w:rFonts w:ascii="Times New Roman" w:hAnsi="Times New Roman"/>
           <w:b/>
           <w:color w:val="337AB7"/>
-          <w:sz w:val="26"/>
+          <w:sz w:val="24"/>
         </w:rPr>
         <w:t>4.3. Kế Hoạch Tải Nhân Sự Theo Tuần &amp; Điều Hòa Nguồn Lực (Resource Leveling)</w:t>
       </w:r>
     </w:p>
     <w:p>
       <w:pPr>
-        <w:spacing w:line="276" w:lineRule="auto" w:after="80"/>
+        <w:spacing w:line="276" w:lineRule="auto" w:after="60"/>
       </w:pPr>
+      <w:r>
+        <w:rPr>
+          <w:rFonts w:ascii="Times New Roman" w:hAnsi="Times New Roman"/>
+          <w:b/>
+          <w:color w:val="884400"/>
+          <w:sz w:val="19"/>
+        </w:rPr>
+        <w:t xml:space="preserve">[PROJECT_PLAN_MODEL] </w:t>
+      </w:r>
       <w:r>
         <w:rPr>
           <w:rFonts w:ascii="Times New Roman" w:hAnsi="Times New Roman"/>
@@ -12363,7 +12683,7 @@
           <w:color w:val="222222"/>
           <w:sz w:val="22"/>
         </w:rPr>
-        <w:t>Bảng phân bổ thời gian làm việc theo tuần (đơn vị: giờ làm việc). Quỹ thời gian tối đa của mỗi sinh viên được xác định là 25 giờ/tuần để đảm bảo cân bằng với các học phần khác:</w:t>
+        <w:t>Bảng phân bổ thời gian làm việc theo tuần (đơn vị: giờ làm việc). Quỹ thời gian tối đa của mỗi sinh viên được xác định là 25 giờ/tuần [PROJECT_PROPOSAL] để đảm bảo cân bằng với các học phần khác:</w:t>
       </w:r>
     </w:p>
     <w:tbl>
@@ -12400,7 +12720,7 @@
                 <w:rFonts w:ascii="Times New Roman" w:hAnsi="Times New Roman"/>
                 <w:b/>
                 <w:color w:val="FFFFFF"/>
-                <w:sz w:val="19"/>
+                <w:sz w:val="18"/>
               </w:rPr>
               <w:t>Thành Viên</w:t>
             </w:r>
@@ -12420,7 +12740,7 @@
                 <w:rFonts w:ascii="Times New Roman" w:hAnsi="Times New Roman"/>
                 <w:b/>
                 <w:color w:val="FFFFFF"/>
-                <w:sz w:val="19"/>
+                <w:sz w:val="18"/>
               </w:rPr>
               <w:t>T1</w:t>
             </w:r>
@@ -12440,7 +12760,7 @@
                 <w:rFonts w:ascii="Times New Roman" w:hAnsi="Times New Roman"/>
                 <w:b/>
                 <w:color w:val="FFFFFF"/>
-                <w:sz w:val="19"/>
+                <w:sz w:val="18"/>
               </w:rPr>
               <w:t>T2</w:t>
             </w:r>
@@ -12460,7 +12780,7 @@
                 <w:rFonts w:ascii="Times New Roman" w:hAnsi="Times New Roman"/>
                 <w:b/>
                 <w:color w:val="FFFFFF"/>
-                <w:sz w:val="19"/>
+                <w:sz w:val="18"/>
               </w:rPr>
               <w:t>T3</w:t>
             </w:r>
@@ -12480,7 +12800,7 @@
                 <w:rFonts w:ascii="Times New Roman" w:hAnsi="Times New Roman"/>
                 <w:b/>
                 <w:color w:val="FFFFFF"/>
-                <w:sz w:val="19"/>
+                <w:sz w:val="18"/>
               </w:rPr>
               <w:t>T4</w:t>
             </w:r>
@@ -12500,7 +12820,7 @@
                 <w:rFonts w:ascii="Times New Roman" w:hAnsi="Times New Roman"/>
                 <w:b/>
                 <w:color w:val="FFFFFF"/>
-                <w:sz w:val="19"/>
+                <w:sz w:val="18"/>
               </w:rPr>
               <w:t>T5</w:t>
             </w:r>
@@ -12520,7 +12840,7 @@
                 <w:rFonts w:ascii="Times New Roman" w:hAnsi="Times New Roman"/>
                 <w:b/>
                 <w:color w:val="FFFFFF"/>
-                <w:sz w:val="19"/>
+                <w:sz w:val="18"/>
               </w:rPr>
               <w:t>T6</w:t>
             </w:r>
@@ -12540,7 +12860,7 @@
                 <w:rFonts w:ascii="Times New Roman" w:hAnsi="Times New Roman"/>
                 <w:b/>
                 <w:color w:val="FFFFFF"/>
-                <w:sz w:val="19"/>
+                <w:sz w:val="18"/>
               </w:rPr>
               <w:t>T7</w:t>
             </w:r>
@@ -12560,7 +12880,7 @@
                 <w:rFonts w:ascii="Times New Roman" w:hAnsi="Times New Roman"/>
                 <w:b/>
                 <w:color w:val="FFFFFF"/>
-                <w:sz w:val="19"/>
+                <w:sz w:val="18"/>
               </w:rPr>
               <w:t>Tổng</w:t>
             </w:r>
@@ -12580,7 +12900,7 @@
                 <w:rFonts w:ascii="Times New Roman" w:hAnsi="Times New Roman"/>
                 <w:b/>
                 <w:color w:val="FFFFFF"/>
-                <w:sz w:val="19"/>
+                <w:sz w:val="18"/>
               </w:rPr>
               <w:t>Đánh giá</w:t>
             </w:r>
@@ -13649,8 +13969,17 @@
     </w:p>
     <w:p>
       <w:pPr>
-        <w:spacing w:line="276" w:lineRule="auto" w:after="80"/>
+        <w:spacing w:line="276" w:lineRule="auto" w:after="60"/>
       </w:pPr>
+      <w:r>
+        <w:rPr>
+          <w:rFonts w:ascii="Times New Roman" w:hAnsi="Times New Roman"/>
+          <w:b/>
+          <w:color w:val="884400"/>
+          <w:sz w:val="19"/>
+        </w:rPr>
+        <w:t xml:space="preserve">[PROJECT_PLAN_MODEL] </w:t>
+      </w:r>
       <w:r>
         <w:rPr>
           <w:rFonts w:ascii="Times New Roman" w:hAnsi="Times New Roman"/>
@@ -13667,12 +13996,12 @@
           <w:color w:val="222222"/>
           <w:sz w:val="22"/>
         </w:rPr>
-        <w:t>Phân tích tình huống điều hòa nguồn lực (Resource Leveling Scenario):</w:t>
+        <w:t>Phân tích tình huống điều hòa nguồn lực (Resource Leveling Scenario) [PROJECT_PLAN_MODEL]:</w:t>
       </w:r>
     </w:p>
     <w:p>
       <w:pPr>
-        <w:spacing w:line="276" w:lineRule="auto" w:after="80"/>
+        <w:spacing w:line="276" w:lineRule="auto" w:after="60"/>
       </w:pPr>
       <w:r>
         <w:rPr>
@@ -13733,21 +14062,21 @@
     <w:p>
       <w:pPr>
         <w:keepNext/>
-        <w:spacing w:before="160" w:after="80"/>
+        <w:spacing w:before="140" w:after="60"/>
       </w:pPr>
       <w:r>
         <w:rPr>
           <w:rFonts w:ascii="Times New Roman" w:hAnsi="Times New Roman"/>
           <w:b/>
           <w:color w:val="337AB7"/>
-          <w:sz w:val="26"/>
+          <w:sz w:val="24"/>
         </w:rPr>
         <w:t>4.4. Kế Hoạch Phát Triển Nhóm &amp; Động Viên Nhân Sự (Team Development)</w:t>
       </w:r>
     </w:p>
     <w:p>
       <w:pPr>
-        <w:spacing w:line="276" w:lineRule="auto" w:after="80"/>
+        <w:spacing w:line="276" w:lineRule="auto" w:after="60"/>
       </w:pPr>
       <w:r>
         <w:rPr>
@@ -13882,14 +14211,14 @@
     <w:p>
       <w:pPr>
         <w:keepNext/>
-        <w:spacing w:before="240" w:after="120"/>
+        <w:spacing w:before="200" w:after="80"/>
       </w:pPr>
       <w:r>
         <w:rPr>
           <w:rFonts w:ascii="Times New Roman" w:hAnsi="Times New Roman"/>
           <w:b/>
           <w:color w:val="1B365D"/>
-          <w:sz w:val="30"/>
+          <w:sz w:val="28"/>
         </w:rPr>
         <w:t>CHƯƠNG 5: KẾT LUẬN &amp; ĐÁNH GIÁ KẾ HOẠCH DỰ ÁN</w:t>
       </w:r>
@@ -13897,21 +14226,21 @@
     <w:p>
       <w:pPr>
         <w:keepNext/>
-        <w:spacing w:before="160" w:after="80"/>
+        <w:spacing w:before="140" w:after="60"/>
       </w:pPr>
       <w:r>
         <w:rPr>
           <w:rFonts w:ascii="Times New Roman" w:hAnsi="Times New Roman"/>
           <w:b/>
           <w:color w:val="337AB7"/>
-          <w:sz w:val="26"/>
+          <w:sz w:val="24"/>
         </w:rPr>
         <w:t>5.1. Đánh Giá Khả Thi Của Hồ Sơ Kế Hoạch</w:t>
       </w:r>
     </w:p>
     <w:p>
       <w:pPr>
-        <w:spacing w:line="276" w:lineRule="auto" w:after="80"/>
+        <w:spacing w:line="276" w:lineRule="auto" w:after="60"/>
       </w:pPr>
       <w:r>
         <w:rPr>
@@ -13995,14 +14324,14 @@
     <w:p>
       <w:pPr>
         <w:keepNext/>
-        <w:spacing w:before="160" w:after="80"/>
+        <w:spacing w:before="140" w:after="60"/>
       </w:pPr>
       <w:r>
         <w:rPr>
           <w:rFonts w:ascii="Times New Roman" w:hAnsi="Times New Roman"/>
           <w:b/>
           <w:color w:val="337AB7"/>
-          <w:sz w:val="26"/>
+          <w:sz w:val="24"/>
         </w:rPr>
         <w:t>5.2. Bài Học Kinh Nghiệm Trong Quản Lý Dự Án CNTT</w:t>
       </w:r>
@@ -14079,14 +14408,14 @@
     <w:p>
       <w:pPr>
         <w:keepNext/>
-        <w:spacing w:before="240" w:after="120"/>
+        <w:spacing w:before="200" w:after="80"/>
       </w:pPr>
       <w:r>
         <w:rPr>
           <w:rFonts w:ascii="Times New Roman" w:hAnsi="Times New Roman"/>
           <w:b/>
           <w:color w:val="1B365D"/>
-          <w:sz w:val="30"/>
+          <w:sz w:val="28"/>
         </w:rPr>
         <w:t>TÀI LIỆU THAM KHẢO (REFERENCES)</w:t>
       </w:r>
@@ -14237,14 +14566,14 @@
     <w:p>
       <w:pPr>
         <w:keepNext/>
-        <w:spacing w:before="240" w:after="120"/>
+        <w:spacing w:before="200" w:after="80"/>
       </w:pPr>
       <w:r>
         <w:rPr>
           <w:rFonts w:ascii="Times New Roman" w:hAnsi="Times New Roman"/>
           <w:b/>
           <w:color w:val="1B365D"/>
-          <w:sz w:val="30"/>
+          <w:sz w:val="28"/>
         </w:rPr>
         <w:t>PHẦN PHỤ LỤC MINH CHỨNG (APPENDICES)</w:t>
       </w:r>
@@ -14252,22 +14581,31 @@
     <w:p>
       <w:pPr>
         <w:keepNext/>
-        <w:spacing w:before="160" w:after="80"/>
+        <w:spacing w:before="140" w:after="60"/>
       </w:pPr>
       <w:r>
         <w:rPr>
           <w:rFonts w:ascii="Times New Roman" w:hAnsi="Times New Roman"/>
           <w:b/>
           <w:color w:val="337AB7"/>
-          <w:sz w:val="26"/>
+          <w:sz w:val="24"/>
         </w:rPr>
-        <w:t>Phụ Lục 1: Bảng Phân Công Đóng Góp Làm Bài Giữa Kỳ</w:t>
+        <w:t>Phụ Lục 1: Bảng Phân Công Trách Nhiệm Đề Xuất Giữa Kỳ</w:t>
       </w:r>
     </w:p>
     <w:p>
       <w:pPr>
-        <w:spacing w:line="276" w:lineRule="auto" w:after="80"/>
+        <w:spacing w:line="276" w:lineRule="auto" w:after="60"/>
       </w:pPr>
+      <w:r>
+        <w:rPr>
+          <w:rFonts w:ascii="Times New Roman" w:hAnsi="Times New Roman"/>
+          <w:b/>
+          <w:color w:val="884400"/>
+          <w:sz w:val="19"/>
+        </w:rPr>
+        <w:t xml:space="preserve">[PROPOSED_ASSIGNMENT_PENDING_USER_APPROVAL] </w:t>
+      </w:r>
       <w:r>
         <w:rPr>
           <w:rFonts w:ascii="Times New Roman" w:hAnsi="Times New Roman"/>
@@ -14275,7 +14613,7 @@
           <w:color w:val="222222"/>
           <w:sz w:val="22"/>
         </w:rPr>
-        <w:t>*(Trạng thái phân công: PROPOSED_ASSIGNMENT_PENDING_USER_APPROVAL — Phân công biên soạn và thuyết trình đề xuất chờ Người dùng phê duyệt)*:</w:t>
+        <w:t>*(Trạng thái phân công: PROPOSED_ASSIGNMENT_PENDING_USER_APPROVAL — Tỷ lệ đóng góp đề xuất chờ Người dùng và Nhóm phê duyệt)*:</w:t>
       </w:r>
     </w:p>
     <w:tbl>
@@ -14307,7 +14645,7 @@
                 <w:rFonts w:ascii="Times New Roman" w:hAnsi="Times New Roman"/>
                 <w:b/>
                 <w:color w:val="FFFFFF"/>
-                <w:sz w:val="19"/>
+                <w:sz w:val="18"/>
               </w:rPr>
               <w:t>Họ và Tên</w:t>
             </w:r>
@@ -14327,7 +14665,7 @@
                 <w:rFonts w:ascii="Times New Roman" w:hAnsi="Times New Roman"/>
                 <w:b/>
                 <w:color w:val="FFFFFF"/>
-                <w:sz w:val="19"/>
+                <w:sz w:val="18"/>
               </w:rPr>
               <w:t>Mã SV</w:t>
             </w:r>
@@ -14347,7 +14685,7 @@
                 <w:rFonts w:ascii="Times New Roman" w:hAnsi="Times New Roman"/>
                 <w:b/>
                 <w:color w:val="FFFFFF"/>
-                <w:sz w:val="19"/>
+                <w:sz w:val="18"/>
               </w:rPr>
               <w:t>Nội dung đảm nhiệm chính</w:t>
             </w:r>
@@ -14367,7 +14705,7 @@
                 <w:rFonts w:ascii="Times New Roman" w:hAnsi="Times New Roman"/>
                 <w:b/>
                 <w:color w:val="FFFFFF"/>
-                <w:sz w:val="19"/>
+                <w:sz w:val="18"/>
               </w:rPr>
               <w:t>Phần thuyết trình dự kiến</w:t>
             </w:r>
@@ -14387,7 +14725,7 @@
                 <w:rFonts w:ascii="Times New Roman" w:hAnsi="Times New Roman"/>
                 <w:b/>
                 <w:color w:val="FFFFFF"/>
-                <w:sz w:val="19"/>
+                <w:sz w:val="18"/>
               </w:rPr>
               <w:t>Tỷ lệ đề xuất</w:t>
             </w:r>
@@ -14806,22 +15144,31 @@
     <w:p>
       <w:pPr>
         <w:keepNext/>
-        <w:spacing w:before="160" w:after="80"/>
+        <w:spacing w:before="140" w:after="60"/>
       </w:pPr>
       <w:r>
         <w:rPr>
           <w:rFonts w:ascii="Times New Roman" w:hAnsi="Times New Roman"/>
           <w:b/>
           <w:color w:val="337AB7"/>
-          <w:sz w:val="26"/>
+          <w:sz w:val="24"/>
         </w:rPr>
-        <w:t>Phụ Lục 2: Mẫu Biên Bản Họp Nhóm Định Kỳ (Meeting Minutes)</w:t>
+        <w:t>Phụ Lục 2: Biểu Mẫu Biên Bản Họp Nhóm Định Kỳ</w:t>
       </w:r>
     </w:p>
     <w:p>
       <w:pPr>
-        <w:spacing w:line="276" w:lineRule="auto" w:after="80"/>
+        <w:spacing w:line="276" w:lineRule="auto" w:after="60"/>
       </w:pPr>
+      <w:r>
+        <w:rPr>
+          <w:rFonts w:ascii="Times New Roman" w:hAnsi="Times New Roman"/>
+          <w:b/>
+          <w:color w:val="884400"/>
+          <w:sz w:val="19"/>
+        </w:rPr>
+        <w:t xml:space="preserve">[TEMPLATE_REQUIRES_TEAM_COMPLETION] </w:t>
+      </w:r>
       <w:r>
         <w:rPr>
           <w:rFonts w:ascii="Times New Roman" w:hAnsi="Times New Roman"/>
@@ -14829,7 +15176,7 @@
           <w:color w:val="222222"/>
           <w:sz w:val="22"/>
         </w:rPr>
-        <w:t xml:space="preserve">Biên bản 01: </w:t>
+        <w:t xml:space="preserve">Biểu mẫu Biên bản 01: </w:t>
       </w:r>
       <w:r>
         <w:rPr>
@@ -14838,7 +15185,7 @@
           <w:color w:val="222222"/>
           <w:sz w:val="22"/>
         </w:rPr>
-        <w:t>Biên bản họp số 01 (Khởi động lập kế hoạch dự án):</w:t>
+        <w:t>Biên bản họp số 01 [TEMPLATE_REQUIRES_TEAM_COMPLETION]:</w:t>
       </w:r>
     </w:p>
     <w:p>
@@ -14861,7 +15208,7 @@
           <w:color w:val="222222"/>
           <w:sz w:val="22"/>
         </w:rPr>
-        <w:t>Thời gian &amp; Địa điểm: 19:30 ngày 15/10/2026, Họp trực tuyến qua Google Meet.</w:t>
+        <w:t>Thời gian &amp; Hình thức: [Nhóm điền: Ngày giờ, Địa điểm hoặc Link họp trực tuyến].</w:t>
       </w:r>
     </w:p>
     <w:p>
@@ -14884,7 +15231,7 @@
           <w:color w:val="222222"/>
           <w:sz w:val="22"/>
         </w:rPr>
-        <w:t>Thành phần tham dự: Đủ 4/4 thành viên (Nguyễn Minh Hiếu, Nguyễn Văn Cường, Hoàng Bảo Long, Vũ Thị Thu Hướng).</w:t>
+        <w:t>Thành phần tham dự: [Nhóm điền: Danh sách thành viên có mặt, vắng mặt có lý do].</w:t>
       </w:r>
     </w:p>
     <w:p>
@@ -14907,7 +15254,7 @@
           <w:color w:val="222222"/>
           <w:sz w:val="22"/>
         </w:rPr>
-        <w:t>Nội dung cuộc họp: Thống nhất lựa chọn đề tài WorkSphere; phân tích bối cảnh và xác lập 4 mục tiêu đo lường được; bầu Nguyễn Minh Hiếu làm Trưởng nhóm (PM); phân chia trách nhiệm nghiên cứu 4 chương trọng tâm của giáo trình.</w:t>
+        <w:t>Nội dung cuộc họp: Thống nhất lựa chọn đề tài WorkSphere; phân tích bối cảnh và xác lập 4 mục tiêu đo lường được; bầu Nguyễn Minh Hiếu làm Trưởng nhóm chính thức; phân chia trách nhiệm nghiên cứu 4 chương trọng tâm của giáo trình.</w:t>
       </w:r>
     </w:p>
     <w:p>
@@ -14930,13 +15277,22 @@
           <w:color w:val="222222"/>
           <w:sz w:val="22"/>
         </w:rPr>
-        <w:t>Kết luận &amp; Giao việc: Hiếu soạn thảo Charter và SOW; Cường và Long rà soát kiến trúc và CSDL; Hướng chuẩn bị tiêu chí nghiệm thu kiểm thử. Thời hạn hoàn thành: 18/10/2026.</w:t>
+        <w:t>Kết luận &amp; Giao việc: [Nhóm điền: Các đầu việc đã phân công cụ thể, thời hạn hoàn thành và chữ ký xác nhận của các thành viên].</w:t>
       </w:r>
     </w:p>
     <w:p>
       <w:pPr>
-        <w:spacing w:line="276" w:lineRule="auto" w:after="80"/>
+        <w:spacing w:line="276" w:lineRule="auto" w:after="60"/>
       </w:pPr>
+      <w:r>
+        <w:rPr>
+          <w:rFonts w:ascii="Times New Roman" w:hAnsi="Times New Roman"/>
+          <w:b/>
+          <w:color w:val="884400"/>
+          <w:sz w:val="19"/>
+        </w:rPr>
+        <w:t xml:space="preserve">[TEMPLATE_REQUIRES_TEAM_COMPLETION] </w:t>
+      </w:r>
       <w:r>
         <w:rPr>
           <w:rFonts w:ascii="Times New Roman" w:hAnsi="Times New Roman"/>
@@ -14944,7 +15300,7 @@
           <w:color w:val="222222"/>
           <w:sz w:val="22"/>
         </w:rPr>
-        <w:t xml:space="preserve">Biên bản 02: </w:t>
+        <w:t xml:space="preserve">Biểu mẫu Biên bản 02: </w:t>
       </w:r>
       <w:r>
         <w:rPr>
@@ -14953,7 +15309,7 @@
           <w:color w:val="222222"/>
           <w:sz w:val="22"/>
         </w:rPr>
-        <w:t>Biên bản họp số 02 (Rà soát WBS, Tính toán CPM và Hoàn thiện Hồ sơ):</w:t>
+        <w:t>Biên bản họp số 02 [TEMPLATE_REQUIRES_TEAM_COMPLETION]:</w:t>
       </w:r>
     </w:p>
     <w:p>
@@ -14976,7 +15332,7 @@
           <w:color w:val="222222"/>
           <w:sz w:val="22"/>
         </w:rPr>
-        <w:t>Thời gian &amp; Địa điểm: 20:00 ngày 22/10/2026, Họp trực tiếp tại Thư viện Trường Đại học CMC.</w:t>
+        <w:t>Thời gian &amp; Hình thức: [Nhóm điền: Ngày giờ, Địa điểm họp].</w:t>
       </w:r>
     </w:p>
     <w:p>
@@ -14999,7 +15355,7 @@
           <w:color w:val="222222"/>
           <w:sz w:val="22"/>
         </w:rPr>
-        <w:t>Thành phần tham dự: Đủ 4/4 thành viên.</w:t>
+        <w:t>Thành phần tham dự: [Nhóm điền: Danh sách thành viên tham dự].</w:t>
       </w:r>
     </w:p>
     <w:p>
@@ -15022,7 +15378,7 @@
           <w:color w:val="222222"/>
           <w:sz w:val="22"/>
         </w:rPr>
-        <w:t>Nội dung cuộc họp: Kiểm tra chéo 14 gói công việc WBS; thống nhất ước lượng PERT 3 điểm; xác định đường găng CPM 51 ngày; xử lý xung đột tải nhân sự của Hoàng Bảo Long trong Tuần 3; tổng duyệt tệp tính toán Excel và tài liệu báo cáo.</w:t>
+        <w:t>Nội dung cuộc họp: Rà soát 14 gói công việc WBS; thống nhất ước lượng PERT 3 điểm; xác định đường găng CPM 51 ngày; xử lý xung đột tải nhân sự của Hoàng Bảo Long trong Tuần 3; tổng duyệt tệp tính toán Excel và tài liệu báo cáo.</w:t>
       </w:r>
     </w:p>
     <w:p>
@@ -15045,22 +15401,22 @@
           <w:color w:val="222222"/>
           <w:sz w:val="22"/>
         </w:rPr>
-        <w:t>Kết luận &amp; Giao việc: Nhóm thống nhất 100% nội dung hồ sơ bài tập nhóm giữa kỳ; sẵn sàng xuất bản tài liệu Word, PDF và chuẩn bị slide thuyết trình bảo vệ trước giảng viên.</w:t>
+        <w:t>Kết luận &amp; Giao việc: [Nhóm điền: Ý kiến thống nhất cuối cùng trước khi xuất bản hồ sơ và chữ ký xác nhận của các thành viên].</w:t>
       </w:r>
     </w:p>
     <w:p>
       <w:pPr>
         <w:keepNext/>
-        <w:spacing w:before="160" w:after="80"/>
+        <w:spacing w:before="140" w:after="60"/>
       </w:pPr>
       <w:r>
         <w:rPr>
           <w:rFonts w:ascii="Times New Roman" w:hAnsi="Times New Roman"/>
           <w:b/>
           <w:color w:val="337AB7"/>
-          <w:sz w:val="26"/>
+          <w:sz w:val="24"/>
         </w:rPr>
-        <w:t>Phụ Lục 3: Mẫu Nhật Ký Công Việc Cá Nhân (Personal Work Log Template)</w:t>
+        <w:t>Phụ Lục 3: Biểu Mẫu Nhật Ký Công Việc Cá Nhân</w:t>
       </w:r>
     </w:p>
     <w:tbl>
@@ -15091,9 +15447,49 @@
                 <w:rFonts w:ascii="Times New Roman" w:hAnsi="Times New Roman"/>
                 <w:b/>
                 <w:color w:val="FFFFFF"/>
-                <w:sz w:val="19"/>
+                <w:sz w:val="18"/>
               </w:rPr>
               <w:t>Thành viên</w:t>
+            </w:r>
+          </w:p>
+        </w:tc>
+        <w:tc>
+          <w:tcPr>
+            <w:tcW w:type="dxa" w:w="1296"/>
+            <w:shd w:fill="1B365D"/>
+          </w:tcPr>
+          <w:p>
+            <w:pPr>
+              <w:jc w:val="center"/>
+            </w:pPr>
+            <w:r>
+              <w:rPr>
+                <w:rFonts w:ascii="Times New Roman" w:hAnsi="Times New Roman"/>
+                <w:b/>
+                <w:color w:val="FFFFFF"/>
+                <w:sz w:val="18"/>
+              </w:rPr>
+              <w:t>Thời gian</w:t>
+            </w:r>
+          </w:p>
+        </w:tc>
+        <w:tc>
+          <w:tcPr>
+            <w:tcW w:type="dxa" w:w="4320"/>
+            <w:shd w:fill="1B365D"/>
+          </w:tcPr>
+          <w:p>
+            <w:pPr>
+              <w:jc w:val="center"/>
+            </w:pPr>
+            <w:r>
+              <w:rPr>
+                <w:rFonts w:ascii="Times New Roman" w:hAnsi="Times New Roman"/>
+                <w:b/>
+                <w:color w:val="FFFFFF"/>
+                <w:sz w:val="18"/>
+              </w:rPr>
+              <w:t>Nhiệm vụ thực hiện cụ thể</w:t>
             </w:r>
           </w:p>
         </w:tc>
@@ -15111,47 +15507,7 @@
                 <w:rFonts w:ascii="Times New Roman" w:hAnsi="Times New Roman"/>
                 <w:b/>
                 <w:color w:val="FFFFFF"/>
-                <w:sz w:val="19"/>
-              </w:rPr>
-              <w:t>Thời gian</w:t>
-            </w:r>
-          </w:p>
-        </w:tc>
-        <w:tc>
-          <w:tcPr>
-            <w:tcW w:type="dxa" w:w="4032"/>
-            <w:shd w:fill="1B365D"/>
-          </w:tcPr>
-          <w:p>
-            <w:pPr>
-              <w:jc w:val="center"/>
-            </w:pPr>
-            <w:r>
-              <w:rPr>
-                <w:rFonts w:ascii="Times New Roman" w:hAnsi="Times New Roman"/>
-                <w:b/>
-                <w:color w:val="FFFFFF"/>
-                <w:sz w:val="19"/>
-              </w:rPr>
-              <w:t>Nhiệm vụ thực hiện cụ thể</w:t>
-            </w:r>
-          </w:p>
-        </w:tc>
-        <w:tc>
-          <w:tcPr>
-            <w:tcW w:type="dxa" w:w="1584"/>
-            <w:shd w:fill="1B365D"/>
-          </w:tcPr>
-          <w:p>
-            <w:pPr>
-              <w:jc w:val="center"/>
-            </w:pPr>
-            <w:r>
-              <w:rPr>
-                <w:rFonts w:ascii="Times New Roman" w:hAnsi="Times New Roman"/>
-                <w:b/>
-                <w:color w:val="FFFFFF"/>
-                <w:sz w:val="19"/>
+                <w:sz w:val="18"/>
               </w:rPr>
               <w:t>Đầu ra xác thực</w:t>
             </w:r>
@@ -15181,12 +15537,94 @@
         </w:tc>
         <w:tc>
           <w:tcPr>
+            <w:tcW w:type="dxa" w:w="1296"/>
+            <w:shd w:fill="F8F9FA"/>
+          </w:tcPr>
+          <w:p>
+            <w:pPr>
+              <w:spacing w:line="252" w:lineRule="auto" w:after="40"/>
+              <w:jc w:val="center"/>
+            </w:pPr>
+            <w:r>
+              <w:rPr>
+                <w:rFonts w:ascii="Times New Roman" w:hAnsi="Times New Roman"/>
+                <w:color w:val="222222"/>
+                <w:sz w:val="17"/>
+              </w:rPr>
+              <w:t>[Nhóm điền]</w:t>
+            </w:r>
+          </w:p>
+        </w:tc>
+        <w:tc>
+          <w:tcPr>
+            <w:tcW w:type="dxa" w:w="4320"/>
+            <w:shd w:fill="F8F9FA"/>
+          </w:tcPr>
+          <w:p>
+            <w:pPr>
+              <w:spacing w:line="252" w:lineRule="auto" w:after="40"/>
+              <w:jc w:val="left"/>
+            </w:pPr>
+            <w:r>
+              <w:rPr>
+                <w:rFonts w:ascii="Times New Roman" w:hAnsi="Times New Roman"/>
+                <w:color w:val="222222"/>
+                <w:sz w:val="17"/>
+              </w:rPr>
+              <w:t>Chủ trì họp nhóm, viết SOW, phân rã WBS 3 cấp, tính toán CPM/PERT, tổng hợp báo cáo</w:t>
+            </w:r>
+          </w:p>
+        </w:tc>
+        <w:tc>
+          <w:tcPr>
             <w:tcW w:type="dxa" w:w="1584"/>
             <w:shd w:fill="F8F9FA"/>
           </w:tcPr>
           <w:p>
             <w:pPr>
               <w:spacing w:line="252" w:lineRule="auto" w:after="40"/>
+              <w:jc w:val="left"/>
+            </w:pPr>
+            <w:r>
+              <w:rPr>
+                <w:rFonts w:ascii="Times New Roman" w:hAnsi="Times New Roman"/>
+                <w:color w:val="222222"/>
+                <w:sz w:val="17"/>
+              </w:rPr>
+              <w:t>[Nhóm đính kèm link/ảnh]</w:t>
+            </w:r>
+          </w:p>
+        </w:tc>
+      </w:tr>
+      <w:tr>
+        <w:tc>
+          <w:tcPr>
+            <w:tcW w:type="dxa" w:w="1872"/>
+            <w:shd w:fill="FFFFFF"/>
+          </w:tcPr>
+          <w:p>
+            <w:pPr>
+              <w:spacing w:line="252" w:lineRule="auto" w:after="40"/>
+              <w:jc w:val="left"/>
+            </w:pPr>
+            <w:r>
+              <w:rPr>
+                <w:rFonts w:ascii="Times New Roman" w:hAnsi="Times New Roman"/>
+                <w:color w:val="222222"/>
+                <w:sz w:val="17"/>
+              </w:rPr>
+              <w:t>Nguyễn Văn Cường</w:t>
+            </w:r>
+          </w:p>
+        </w:tc>
+        <w:tc>
+          <w:tcPr>
+            <w:tcW w:type="dxa" w:w="1296"/>
+            <w:shd w:fill="FFFFFF"/>
+          </w:tcPr>
+          <w:p>
+            <w:pPr>
+              <w:spacing w:line="252" w:lineRule="auto" w:after="40"/>
               <w:jc w:val="center"/>
             </w:pPr>
             <w:r>
@@ -15195,18 +15633,100 @@
                 <w:color w:val="222222"/>
                 <w:sz w:val="17"/>
               </w:rPr>
-              <w:t>15/10 - 22/10</w:t>
-            </w:r>
-          </w:p>
-        </w:tc>
-        <w:tc>
-          <w:tcPr>
-            <w:tcW w:type="dxa" w:w="4032"/>
+              <w:t>[Nhóm điền]</w:t>
+            </w:r>
+          </w:p>
+        </w:tc>
+        <w:tc>
+          <w:tcPr>
+            <w:tcW w:type="dxa" w:w="4320"/>
+            <w:shd w:fill="FFFFFF"/>
+          </w:tcPr>
+          <w:p>
+            <w:pPr>
+              <w:spacing w:line="252" w:lineRule="auto" w:after="40"/>
+              <w:jc w:val="left"/>
+            </w:pPr>
+            <w:r>
+              <w:rPr>
+                <w:rFonts w:ascii="Times New Roman" w:hAnsi="Times New Roman"/>
+                <w:color w:val="222222"/>
+                <w:sz w:val="17"/>
+              </w:rPr>
+              <w:t>Xác định gói công việc Mobile, vẽ biểu đồ Gantt, thiết kế sơ đồ mạng PDM</w:t>
+            </w:r>
+          </w:p>
+        </w:tc>
+        <w:tc>
+          <w:tcPr>
+            <w:tcW w:type="dxa" w:w="1584"/>
+            <w:shd w:fill="FFFFFF"/>
+          </w:tcPr>
+          <w:p>
+            <w:pPr>
+              <w:spacing w:line="252" w:lineRule="auto" w:after="40"/>
+              <w:jc w:val="left"/>
+            </w:pPr>
+            <w:r>
+              <w:rPr>
+                <w:rFonts w:ascii="Times New Roman" w:hAnsi="Times New Roman"/>
+                <w:color w:val="222222"/>
+                <w:sz w:val="17"/>
+              </w:rPr>
+              <w:t>[Nhóm đính kèm link/ảnh]</w:t>
+            </w:r>
+          </w:p>
+        </w:tc>
+      </w:tr>
+      <w:tr>
+        <w:tc>
+          <w:tcPr>
+            <w:tcW w:type="dxa" w:w="1872"/>
             <w:shd w:fill="F8F9FA"/>
           </w:tcPr>
           <w:p>
             <w:pPr>
               <w:spacing w:line="252" w:lineRule="auto" w:after="40"/>
+              <w:jc w:val="center"/>
+            </w:pPr>
+            <w:r>
+              <w:rPr>
+                <w:rFonts w:ascii="Times New Roman" w:hAnsi="Times New Roman"/>
+                <w:color w:val="222222"/>
+                <w:sz w:val="17"/>
+              </w:rPr>
+              <w:t>Hoàng Bảo Long</w:t>
+            </w:r>
+          </w:p>
+        </w:tc>
+        <w:tc>
+          <w:tcPr>
+            <w:tcW w:type="dxa" w:w="1296"/>
+            <w:shd w:fill="F8F9FA"/>
+          </w:tcPr>
+          <w:p>
+            <w:pPr>
+              <w:spacing w:line="252" w:lineRule="auto" w:after="40"/>
+              <w:jc w:val="center"/>
+            </w:pPr>
+            <w:r>
+              <w:rPr>
+                <w:rFonts w:ascii="Times New Roman" w:hAnsi="Times New Roman"/>
+                <w:color w:val="222222"/>
+                <w:sz w:val="17"/>
+              </w:rPr>
+              <w:t>[Nhóm điền]</w:t>
+            </w:r>
+          </w:p>
+        </w:tc>
+        <w:tc>
+          <w:tcPr>
+            <w:tcW w:type="dxa" w:w="4320"/>
+            <w:shd w:fill="F8F9FA"/>
+          </w:tcPr>
+          <w:p>
+            <w:pPr>
+              <w:spacing w:line="252" w:lineRule="auto" w:after="40"/>
               <w:jc w:val="left"/>
             </w:pPr>
             <w:r>
@@ -15215,7 +15735,7 @@
                 <w:color w:val="222222"/>
                 <w:sz w:val="17"/>
               </w:rPr>
-              <w:t>Chủ trì họp nhóm, viết SOW, phân rã WBS 3 cấp, tính toán CPM/PERT, tổng hợp báo cáo</w:t>
+              <w:t>Xác định gói công việc Backend/DevOps, lập bảng tải nhân sự theo tuần, xử lý điều hòa tải</w:t>
             </w:r>
           </w:p>
         </w:tc>
@@ -15235,7 +15755,7 @@
                 <w:color w:val="222222"/>
                 <w:sz w:val="17"/>
               </w:rPr>
-              <w:t>Bản thảo SOW, Cây WBS, Bảng tính CPM</w:t>
+              <w:t>[Nhóm đính kèm link/ảnh]</w:t>
             </w:r>
           </w:p>
         </w:tc>
@@ -15257,7 +15777,47 @@
                 <w:color w:val="222222"/>
                 <w:sz w:val="17"/>
               </w:rPr>
-              <w:t>Nguyễn Văn Cường</w:t>
+              <w:t>Vũ Thị Thu Hướng</w:t>
+            </w:r>
+          </w:p>
+        </w:tc>
+        <w:tc>
+          <w:tcPr>
+            <w:tcW w:type="dxa" w:w="1296"/>
+            <w:shd w:fill="FFFFFF"/>
+          </w:tcPr>
+          <w:p>
+            <w:pPr>
+              <w:spacing w:line="252" w:lineRule="auto" w:after="40"/>
+              <w:jc w:val="center"/>
+            </w:pPr>
+            <w:r>
+              <w:rPr>
+                <w:rFonts w:ascii="Times New Roman" w:hAnsi="Times New Roman"/>
+                <w:color w:val="222222"/>
+                <w:sz w:val="17"/>
+              </w:rPr>
+              <w:t>[Nhóm điền]</w:t>
+            </w:r>
+          </w:p>
+        </w:tc>
+        <w:tc>
+          <w:tcPr>
+            <w:tcW w:type="dxa" w:w="4320"/>
+            <w:shd w:fill="FFFFFF"/>
+          </w:tcPr>
+          <w:p>
+            <w:pPr>
+              <w:spacing w:line="252" w:lineRule="auto" w:after="40"/>
+              <w:jc w:val="left"/>
+            </w:pPr>
+            <w:r>
+              <w:rPr>
+                <w:rFonts w:ascii="Times New Roman" w:hAnsi="Times New Roman"/>
+                <w:color w:val="222222"/>
+                <w:sz w:val="17"/>
+              </w:rPr>
+              <w:t>Thiết lập tiêu chí nghiệm thu kiểm thử, lập ma trận kỹ năng, soạn thảo ma trận RACI</w:t>
             </w:r>
           </w:p>
         </w:tc>
@@ -15269,26 +15829,6 @@
           <w:p>
             <w:pPr>
               <w:spacing w:line="252" w:lineRule="auto" w:after="40"/>
-              <w:jc w:val="center"/>
-            </w:pPr>
-            <w:r>
-              <w:rPr>
-                <w:rFonts w:ascii="Times New Roman" w:hAnsi="Times New Roman"/>
-                <w:color w:val="222222"/>
-                <w:sz w:val="17"/>
-              </w:rPr>
-              <w:t>16/10 - 23/10</w:t>
-            </w:r>
-          </w:p>
-        </w:tc>
-        <w:tc>
-          <w:tcPr>
-            <w:tcW w:type="dxa" w:w="4032"/>
-            <w:shd w:fill="FFFFFF"/>
-          </w:tcPr>
-          <w:p>
-            <w:pPr>
-              <w:spacing w:line="252" w:lineRule="auto" w:after="40"/>
               <w:jc w:val="left"/>
             </w:pPr>
             <w:r>
@@ -15297,191 +15837,7 @@
                 <w:color w:val="222222"/>
                 <w:sz w:val="17"/>
               </w:rPr>
-              <w:t>Xác định gói công việc Mobile, vẽ biểu đồ Gantt, thiết kế sơ đồ mạng PDM</w:t>
-            </w:r>
-          </w:p>
-        </w:tc>
-        <w:tc>
-          <w:tcPr>
-            <w:tcW w:type="dxa" w:w="1584"/>
-            <w:shd w:fill="FFFFFF"/>
-          </w:tcPr>
-          <w:p>
-            <w:pPr>
-              <w:spacing w:line="252" w:lineRule="auto" w:after="40"/>
-              <w:jc w:val="left"/>
-            </w:pPr>
-            <w:r>
-              <w:rPr>
-                <w:rFonts w:ascii="Times New Roman" w:hAnsi="Times New Roman"/>
-                <w:color w:val="222222"/>
-                <w:sz w:val="17"/>
-              </w:rPr>
-              <w:t>Sơ đồ mạng PDM, Biểu đồ Gantt</w:t>
-            </w:r>
-          </w:p>
-        </w:tc>
-      </w:tr>
-      <w:tr>
-        <w:tc>
-          <w:tcPr>
-            <w:tcW w:type="dxa" w:w="1872"/>
-            <w:shd w:fill="F8F9FA"/>
-          </w:tcPr>
-          <w:p>
-            <w:pPr>
-              <w:spacing w:line="252" w:lineRule="auto" w:after="40"/>
-              <w:jc w:val="center"/>
-            </w:pPr>
-            <w:r>
-              <w:rPr>
-                <w:rFonts w:ascii="Times New Roman" w:hAnsi="Times New Roman"/>
-                <w:color w:val="222222"/>
-                <w:sz w:val="17"/>
-              </w:rPr>
-              <w:t>Hoàng Bảo Long</w:t>
-            </w:r>
-          </w:p>
-        </w:tc>
-        <w:tc>
-          <w:tcPr>
-            <w:tcW w:type="dxa" w:w="1584"/>
-            <w:shd w:fill="F8F9FA"/>
-          </w:tcPr>
-          <w:p>
-            <w:pPr>
-              <w:spacing w:line="252" w:lineRule="auto" w:after="40"/>
-              <w:jc w:val="center"/>
-            </w:pPr>
-            <w:r>
-              <w:rPr>
-                <w:rFonts w:ascii="Times New Roman" w:hAnsi="Times New Roman"/>
-                <w:color w:val="222222"/>
-                <w:sz w:val="17"/>
-              </w:rPr>
-              <w:t>16/10 - 23/10</w:t>
-            </w:r>
-          </w:p>
-        </w:tc>
-        <w:tc>
-          <w:tcPr>
-            <w:tcW w:type="dxa" w:w="4032"/>
-            <w:shd w:fill="F8F9FA"/>
-          </w:tcPr>
-          <w:p>
-            <w:pPr>
-              <w:spacing w:line="252" w:lineRule="auto" w:after="40"/>
-              <w:jc w:val="left"/>
-            </w:pPr>
-            <w:r>
-              <w:rPr>
-                <w:rFonts w:ascii="Times New Roman" w:hAnsi="Times New Roman"/>
-                <w:color w:val="222222"/>
-                <w:sz w:val="17"/>
-              </w:rPr>
-              <w:t>Xác định gói công việc Backend/DevOps, lập bảng tải nhân sự theo tuần, xử lý điều hòa tải</w:t>
-            </w:r>
-          </w:p>
-        </w:tc>
-        <w:tc>
-          <w:tcPr>
-            <w:tcW w:type="dxa" w:w="1584"/>
-            <w:shd w:fill="F8F9FA"/>
-          </w:tcPr>
-          <w:p>
-            <w:pPr>
-              <w:spacing w:line="252" w:lineRule="auto" w:after="40"/>
-              <w:jc w:val="left"/>
-            </w:pPr>
-            <w:r>
-              <w:rPr>
-                <w:rFonts w:ascii="Times New Roman" w:hAnsi="Times New Roman"/>
-                <w:color w:val="222222"/>
-                <w:sz w:val="17"/>
-              </w:rPr>
-              <w:t>Bảng tải nhân sự, Biểu đồ Histogram</w:t>
-            </w:r>
-          </w:p>
-        </w:tc>
-      </w:tr>
-      <w:tr>
-        <w:tc>
-          <w:tcPr>
-            <w:tcW w:type="dxa" w:w="1872"/>
-            <w:shd w:fill="FFFFFF"/>
-          </w:tcPr>
-          <w:p>
-            <w:pPr>
-              <w:spacing w:line="252" w:lineRule="auto" w:after="40"/>
-              <w:jc w:val="left"/>
-            </w:pPr>
-            <w:r>
-              <w:rPr>
-                <w:rFonts w:ascii="Times New Roman" w:hAnsi="Times New Roman"/>
-                <w:color w:val="222222"/>
-                <w:sz w:val="17"/>
-              </w:rPr>
-              <w:t>Vũ Thị Thu Hướng</w:t>
-            </w:r>
-          </w:p>
-        </w:tc>
-        <w:tc>
-          <w:tcPr>
-            <w:tcW w:type="dxa" w:w="1584"/>
-            <w:shd w:fill="FFFFFF"/>
-          </w:tcPr>
-          <w:p>
-            <w:pPr>
-              <w:spacing w:line="252" w:lineRule="auto" w:after="40"/>
-              <w:jc w:val="center"/>
-            </w:pPr>
-            <w:r>
-              <w:rPr>
-                <w:rFonts w:ascii="Times New Roman" w:hAnsi="Times New Roman"/>
-                <w:color w:val="222222"/>
-                <w:sz w:val="17"/>
-              </w:rPr>
-              <w:t>17/10 - 24/10</w:t>
-            </w:r>
-          </w:p>
-        </w:tc>
-        <w:tc>
-          <w:tcPr>
-            <w:tcW w:type="dxa" w:w="4032"/>
-            <w:shd w:fill="FFFFFF"/>
-          </w:tcPr>
-          <w:p>
-            <w:pPr>
-              <w:spacing w:line="252" w:lineRule="auto" w:after="40"/>
-              <w:jc w:val="left"/>
-            </w:pPr>
-            <w:r>
-              <w:rPr>
-                <w:rFonts w:ascii="Times New Roman" w:hAnsi="Times New Roman"/>
-                <w:color w:val="222222"/>
-                <w:sz w:val="17"/>
-              </w:rPr>
-              <w:t>Thiết lập tiêu chí nghiệm thu kiểm thử, lập ma trận kỹ năng, soạn thảo ma trận RACI</w:t>
-            </w:r>
-          </w:p>
-        </w:tc>
-        <w:tc>
-          <w:tcPr>
-            <w:tcW w:type="dxa" w:w="1584"/>
-            <w:shd w:fill="FFFFFF"/>
-          </w:tcPr>
-          <w:p>
-            <w:pPr>
-              <w:spacing w:line="252" w:lineRule="auto" w:after="40"/>
-              <w:jc w:val="left"/>
-            </w:pPr>
-            <w:r>
-              <w:rPr>
-                <w:rFonts w:ascii="Times New Roman" w:hAnsi="Times New Roman"/>
-                <w:color w:val="222222"/>
-                <w:sz w:val="17"/>
-              </w:rPr>
-              <w:t>Tiêu chí nghiệm thu, Ma trận RACI</w:t>
+              <w:t>[Nhóm đính kèm link/ảnh]</w:t>
             </w:r>
           </w:p>
         </w:tc>

</xml_diff>